<commit_message>
docs: add paper v2.1 and TCSE v2.7 drafts with check script
Supersedes v2.0/v2.6; the retired v1.9/v2.5 files are removed. The
rewrite scripts regenerate the docx from the brief, and the new
_check_rules.py verifies the typography and citation gates so a
draft cannot ship with full-width punctuation or numbering drift.
</commit_message>
<xml_diff>
--- a/paper/TCSE_v2.6.docx
+++ b/paper/TCSE_v2.6.docx
@@ -241,28 +241,62 @@
           <w:rFonts w:eastAsia="標楷體" w:hint="eastAsia"/>
           <w:sz w:val="20"/>
         </w:rPr>
-        <w:t>）用於審查，又會遇到三個關卡：模型易產生幻覺（編造看似合理卻不正確之內容）、同一份程式碼前後給出不一致之意見、且不認得個別專案之規範。為同時</w:t>
-      </w:r>
-      <w:r>
-        <w:rPr>
-          <w:rFonts w:eastAsia="標楷體" w:hint="eastAsia"/>
-          <w:sz w:val="20"/>
-        </w:rPr>
-        <w:t>回應此三者，本研究提出一套整合框架，將三項技術綁為一體：以思維鏈（</w:t>
-      </w:r>
-      <w:r>
-        <w:rPr>
-          <w:rFonts w:eastAsia="標楷體" w:hint="eastAsia"/>
-          <w:sz w:val="20"/>
-        </w:rPr>
-        <w:t>Chain-of-Thought, CoT</w:t>
-      </w:r>
-      <w:r>
-        <w:rPr>
-          <w:rFonts w:eastAsia="標楷體" w:hint="eastAsia"/>
-          <w:sz w:val="20"/>
-        </w:rPr>
-        <w:t>）推理把審查拆成摘要、初步審查、靜態分析、程式碼異味偵測與總結等五個循序步驟，讓每步只證一件事而可逐步追溯（對應一致性），以檢索增強生成（</w:t>
+        <w:t>）用於審查，又會遇到三個關卡：模型易產生幻覺（編造看似合理卻不正確之內容）、同一份程式碼前後給出不一致之意見、且不認得個別專案之規範。為同時回應此三者，本研究提出一套整合框架，將三項</w:t>
+      </w:r>
+      <w:proofErr w:type="gramStart"/>
+      <w:r>
+        <w:rPr>
+          <w:rFonts w:eastAsia="標楷體" w:hint="eastAsia"/>
+          <w:sz w:val="20"/>
+        </w:rPr>
+        <w:t>技術綁為一體</w:t>
+      </w:r>
+      <w:proofErr w:type="gramEnd"/>
+      <w:r>
+        <w:rPr>
+          <w:rFonts w:eastAsia="標楷體" w:hint="eastAsia"/>
+          <w:sz w:val="20"/>
+        </w:rPr>
+        <w:t>：以思維鏈（</w:t>
+      </w:r>
+      <w:r>
+        <w:rPr>
+          <w:rFonts w:eastAsia="標楷體" w:hint="eastAsia"/>
+          <w:sz w:val="20"/>
+        </w:rPr>
+        <w:t xml:space="preserve">Chain-of-Thought, </w:t>
+      </w:r>
+      <w:proofErr w:type="spellStart"/>
+      <w:r>
+        <w:rPr>
+          <w:rFonts w:eastAsia="標楷體" w:hint="eastAsia"/>
+          <w:sz w:val="20"/>
+        </w:rPr>
+        <w:t>CoT</w:t>
+      </w:r>
+      <w:proofErr w:type="spellEnd"/>
+      <w:r>
+        <w:rPr>
+          <w:rFonts w:eastAsia="標楷體" w:hint="eastAsia"/>
+          <w:sz w:val="20"/>
+        </w:rPr>
+        <w:t>）推理把審查拆成摘要、初步審查、靜態分析、程式碼異味偵測與總結等五個循序步驟，讓每</w:t>
+      </w:r>
+      <w:proofErr w:type="gramStart"/>
+      <w:r>
+        <w:rPr>
+          <w:rFonts w:eastAsia="標楷體" w:hint="eastAsia"/>
+          <w:sz w:val="20"/>
+        </w:rPr>
+        <w:t>步只證</w:t>
+      </w:r>
+      <w:proofErr w:type="gramEnd"/>
+      <w:r>
+        <w:rPr>
+          <w:rFonts w:eastAsia="標楷體" w:hint="eastAsia"/>
+          <w:sz w:val="20"/>
+        </w:rPr>
+        <w:t>一件事而可逐步追溯（對應一致性），以檢索增強生成（</w:t>
       </w:r>
       <w:r>
         <w:rPr>
@@ -290,8 +324,25 @@
           <w:rFonts w:eastAsia="標楷體" w:hint="eastAsia"/>
           <w:sz w:val="20"/>
         </w:rPr>
-        <w:t>）結合量化低秩適應（</w:t>
-      </w:r>
+        <w:t>）結合量化低</w:t>
+      </w:r>
+      <w:proofErr w:type="gramStart"/>
+      <w:r>
+        <w:rPr>
+          <w:rFonts w:eastAsia="標楷體" w:hint="eastAsia"/>
+          <w:sz w:val="20"/>
+        </w:rPr>
+        <w:t>秩</w:t>
+      </w:r>
+      <w:proofErr w:type="gramEnd"/>
+      <w:r>
+        <w:rPr>
+          <w:rFonts w:eastAsia="標楷體" w:hint="eastAsia"/>
+          <w:sz w:val="20"/>
+        </w:rPr>
+        <w:t>適應（</w:t>
+      </w:r>
+      <w:proofErr w:type="spellStart"/>
       <w:r>
         <w:rPr>
           <w:rFonts w:eastAsia="標楷體" w:hint="eastAsia"/>
@@ -299,19 +350,13 @@
         </w:rPr>
         <w:t>QLoRA</w:t>
       </w:r>
-      <w:r>
-        <w:rPr>
-          <w:rFonts w:eastAsia="標楷體" w:hint="eastAsia"/>
-          <w:sz w:val="20"/>
-        </w:rPr>
-        <w:t>）把教師模型之審查能力轉移至可於有限資源部署之</w:t>
-      </w:r>
-      <w:r>
-        <w:rPr>
-          <w:rFonts w:eastAsia="標楷體" w:hint="eastAsia"/>
-          <w:sz w:val="20"/>
-        </w:rPr>
-        <w:t>輕量學生模型（對應可落地之可維護性）。於</w:t>
+      <w:proofErr w:type="spellEnd"/>
+      <w:r>
+        <w:rPr>
+          <w:rFonts w:eastAsia="標楷體" w:hint="eastAsia"/>
+          <w:sz w:val="20"/>
+        </w:rPr>
+        <w:t>）把教師模型之審查能力轉移至可於有限資源部署之輕量學生模型（對應可落地之可維護性）。於</w:t>
       </w:r>
       <w:r>
         <w:rPr>
@@ -467,12 +512,21 @@
         </w:rPr>
         <w:t>分，百分制），</w:t>
       </w:r>
-      <w:r>
-        <w:rPr>
-          <w:rFonts w:eastAsia="標楷體" w:hint="eastAsia"/>
-          <w:sz w:val="20"/>
-        </w:rPr>
-        <w:t xml:space="preserve">LoRA </w:t>
+      <w:proofErr w:type="spellStart"/>
+      <w:r>
+        <w:rPr>
+          <w:rFonts w:eastAsia="標楷體" w:hint="eastAsia"/>
+          <w:sz w:val="20"/>
+        </w:rPr>
+        <w:t>LoRA</w:t>
+      </w:r>
+      <w:proofErr w:type="spellEnd"/>
+      <w:r>
+        <w:rPr>
+          <w:rFonts w:eastAsia="標楷體" w:hint="eastAsia"/>
+          <w:sz w:val="20"/>
+        </w:rPr>
+        <w:t xml:space="preserve"> </w:t>
       </w:r>
       <w:r>
         <w:rPr>
@@ -493,14 +547,7 @@
           <w:rFonts w:eastAsia="標楷體" w:hint="eastAsia"/>
           <w:sz w:val="20"/>
         </w:rPr>
-        <w:t>分），但解決的是有限資源下保留並穩定教師審查能力此一不同問題，二者互補。整體而言，唯有三項技術整合，方使審查同時具備一致性、可解釋性與可</w:t>
-      </w:r>
-      <w:r>
-        <w:rPr>
-          <w:rFonts w:eastAsia="標楷體" w:hint="eastAsia"/>
-          <w:sz w:val="20"/>
-        </w:rPr>
-        <w:t>維護性。</w:t>
+        <w:t>分），但解決的是有限資源下保留並穩定教師審查能力此一不同問題，二者互補。整體而言，唯有三項技術整合，方使審查同時具備一致性、可解釋性與可維護性。</w:t>
       </w:r>
     </w:p>
     <w:p>
@@ -596,21 +643,30 @@
           <w:rFonts w:eastAsia="標楷體" w:hint="eastAsia"/>
           <w:sz w:val="20"/>
         </w:rPr>
-        <w:t>大型語言模型於自然語言與程式語言理解上的突破，正快速滲透軟體工程之各個環節，從程式碼生成、缺陷偵測到文件撰寫均見其應用。在開發流程中，程式碼審查（</w:t>
-      </w:r>
-      <w:r>
-        <w:rPr>
-          <w:rFonts w:eastAsia="標楷體" w:hint="eastAsia"/>
-          <w:sz w:val="20"/>
-        </w:rPr>
-        <w:t xml:space="preserve">Code </w:t>
-      </w:r>
-      <w:r>
-        <w:rPr>
-          <w:rFonts w:eastAsia="標楷體" w:hint="eastAsia"/>
-          <w:sz w:val="20"/>
-        </w:rPr>
-        <w:t>Review</w:t>
+        <w:t>大型語言模型於自然語言與程式語言理解上的突破，正快速滲透軟體工程之各個環節，從程式碼生成、缺陷偵測到文件</w:t>
+      </w:r>
+      <w:proofErr w:type="gramStart"/>
+      <w:r>
+        <w:rPr>
+          <w:rFonts w:eastAsia="標楷體" w:hint="eastAsia"/>
+          <w:sz w:val="20"/>
+        </w:rPr>
+        <w:t>撰寫均見其</w:t>
+      </w:r>
+      <w:proofErr w:type="gramEnd"/>
+      <w:r>
+        <w:rPr>
+          <w:rFonts w:eastAsia="標楷體" w:hint="eastAsia"/>
+          <w:sz w:val="20"/>
+        </w:rPr>
+        <w:t>應用。在開發流程中，程式碼審查（</w:t>
+      </w:r>
+      <w:r>
+        <w:rPr>
+          <w:rFonts w:eastAsia="標楷體" w:hint="eastAsia"/>
+          <w:sz w:val="20"/>
+        </w:rPr>
+        <w:t>Code Review</w:t>
       </w:r>
       <w:r>
         <w:rPr>
@@ -661,7 +717,23 @@
           <w:rFonts w:eastAsia="標楷體" w:hint="eastAsia"/>
           <w:sz w:val="20"/>
         </w:rPr>
-        <w:t>人工審查的侷限可歸納為三點。其一，處理審查意見所需之時間隨意見數量線性增加</w:t>
+        <w:t>人工審查的侷限可歸納為三點。</w:t>
+      </w:r>
+      <w:proofErr w:type="gramStart"/>
+      <w:r>
+        <w:rPr>
+          <w:rFonts w:eastAsia="標楷體" w:hint="eastAsia"/>
+          <w:sz w:val="20"/>
+        </w:rPr>
+        <w:t>其一，</w:t>
+      </w:r>
+      <w:proofErr w:type="gramEnd"/>
+      <w:r>
+        <w:rPr>
+          <w:rFonts w:eastAsia="標楷體" w:hint="eastAsia"/>
+          <w:sz w:val="20"/>
+        </w:rPr>
+        <w:t>處理審查意見所需之時間隨意見數量線性增加</w:t>
       </w:r>
       <w:r>
         <w:rPr>
@@ -675,7 +747,23 @@
           <w:rFonts w:eastAsia="標楷體" w:hint="eastAsia"/>
           <w:sz w:val="20"/>
         </w:rPr>
-        <w:t>，於大型複雜專案中尤易形成瓶頸</w:t>
+        <w:t>，於大型複雜專案</w:t>
+      </w:r>
+      <w:proofErr w:type="gramStart"/>
+      <w:r>
+        <w:rPr>
+          <w:rFonts w:eastAsia="標楷體" w:hint="eastAsia"/>
+          <w:sz w:val="20"/>
+        </w:rPr>
+        <w:t>中尤易形成</w:t>
+      </w:r>
+      <w:proofErr w:type="gramEnd"/>
+      <w:r>
+        <w:rPr>
+          <w:rFonts w:eastAsia="標楷體" w:hint="eastAsia"/>
+          <w:sz w:val="20"/>
+        </w:rPr>
+        <w:t>瓶頸</w:t>
       </w:r>
       <w:r>
         <w:rPr>
@@ -689,14 +777,7 @@
           <w:rFonts w:eastAsia="標楷體" w:hint="eastAsia"/>
           <w:sz w:val="20"/>
         </w:rPr>
-        <w:t>，並對資深工程師造成額外</w:t>
-      </w:r>
-      <w:r>
-        <w:rPr>
-          <w:rFonts w:eastAsia="標楷體" w:hint="eastAsia"/>
-          <w:sz w:val="20"/>
-        </w:rPr>
-        <w:t>負擔</w:t>
+        <w:t>，並對資深工程師造成額外負擔</w:t>
       </w:r>
       <w:r>
         <w:rPr>
@@ -710,7 +791,23 @@
           <w:rFonts w:eastAsia="標楷體" w:hint="eastAsia"/>
           <w:sz w:val="20"/>
         </w:rPr>
-        <w:t>。其二，傳統靜態分析（</w:t>
+        <w:t>。</w:t>
+      </w:r>
+      <w:proofErr w:type="gramStart"/>
+      <w:r>
+        <w:rPr>
+          <w:rFonts w:eastAsia="標楷體" w:hint="eastAsia"/>
+          <w:sz w:val="20"/>
+        </w:rPr>
+        <w:t>其二，</w:t>
+      </w:r>
+      <w:proofErr w:type="gramEnd"/>
+      <w:r>
+        <w:rPr>
+          <w:rFonts w:eastAsia="標楷體" w:hint="eastAsia"/>
+          <w:sz w:val="20"/>
+        </w:rPr>
+        <w:t>傳統靜態分析（</w:t>
       </w:r>
       <w:r>
         <w:rPr>
@@ -738,7 +835,23 @@
           <w:rFonts w:eastAsia="標楷體" w:hint="eastAsia"/>
           <w:sz w:val="20"/>
         </w:rPr>
-        <w:t>工具雖能於程式執行前依規則檢出語法與風格問題，卻受限於規則僵化，難以涵蓋設計合理性、命名語義等高層次判斷</w:t>
+        <w:t>工具雖能於程式執行前依</w:t>
+      </w:r>
+      <w:proofErr w:type="gramStart"/>
+      <w:r>
+        <w:rPr>
+          <w:rFonts w:eastAsia="標楷體" w:hint="eastAsia"/>
+          <w:sz w:val="20"/>
+        </w:rPr>
+        <w:t>規則檢</w:t>
+      </w:r>
+      <w:proofErr w:type="gramEnd"/>
+      <w:r>
+        <w:rPr>
+          <w:rFonts w:eastAsia="標楷體" w:hint="eastAsia"/>
+          <w:sz w:val="20"/>
+        </w:rPr>
+        <w:t>出語法與風格問題，卻受限於規則僵化，難以涵蓋設計合理性、命名語義等高層次判斷</w:t>
       </w:r>
       <w:r>
         <w:rPr>
@@ -752,7 +865,23 @@
           <w:rFonts w:eastAsia="標楷體" w:hint="eastAsia"/>
           <w:sz w:val="20"/>
         </w:rPr>
-        <w:t>。其三，將大型語言模型導入審查雖能跨越自然語言描述與程式結構之間的鴻溝、掌握程式碼語義與設計意圖並提出符合工程規範之改進建議，但模型本身會帶來三個彼此關聯之障礙：易產生幻覺（即編造看似合理卻不正確之內容）、對同一份程式碼前後給出不一致之意見、且缺乏對個別專案領域規範之約束，往往需搭配人工監督</w:t>
+        <w:t>。其</w:t>
+      </w:r>
+      <w:proofErr w:type="gramStart"/>
+      <w:r>
+        <w:rPr>
+          <w:rFonts w:eastAsia="標楷體" w:hint="eastAsia"/>
+          <w:sz w:val="20"/>
+        </w:rPr>
+        <w:t>三</w:t>
+      </w:r>
+      <w:proofErr w:type="gramEnd"/>
+      <w:r>
+        <w:rPr>
+          <w:rFonts w:eastAsia="標楷體" w:hint="eastAsia"/>
+          <w:sz w:val="20"/>
+        </w:rPr>
+        <w:t>，將大型語言模型導入審查雖能跨越自然語言描述與程式結構之間的鴻溝、掌握程式碼語義與設計意圖並提出符合工程規範之改進建議，但模型本身會帶來三個彼此關聯之障礙：易產生幻覺（即編造看似合理卻不正確之內容）、對同一份程式碼前後給出不一致之意見、且缺乏對個別專案領域規範之約束，往往需搭配人工監督</w:t>
       </w:r>
       <w:r>
         <w:rPr>
@@ -766,14 +895,23 @@
           <w:rFonts w:eastAsia="標楷體" w:hint="eastAsia"/>
           <w:sz w:val="20"/>
         </w:rPr>
-        <w:t>。此</w:t>
-      </w:r>
-      <w:r>
-        <w:rPr>
-          <w:rFonts w:eastAsia="標楷體" w:hint="eastAsia"/>
-          <w:sz w:val="20"/>
-        </w:rPr>
-        <w:t>三者正對應審查最需要的三項性質——可解釋性、一致性與可維護性。如何在發揮</w:t>
+        <w:t>。此三者正對應審查最需要的三項性質</w:t>
+      </w:r>
+      <w:proofErr w:type="gramStart"/>
+      <w:r>
+        <w:rPr>
+          <w:rFonts w:eastAsia="標楷體" w:hint="eastAsia"/>
+          <w:sz w:val="20"/>
+        </w:rPr>
+        <w:t>——</w:t>
+      </w:r>
+      <w:proofErr w:type="gramEnd"/>
+      <w:r>
+        <w:rPr>
+          <w:rFonts w:eastAsia="標楷體" w:hint="eastAsia"/>
+          <w:sz w:val="20"/>
+        </w:rPr>
+        <w:t>可解釋性、一致性與可維護性。如何在發揮</w:t>
       </w:r>
       <w:r>
         <w:rPr>
@@ -880,28 +1018,78 @@
           <w:rFonts w:eastAsia="標楷體" w:hint="eastAsia"/>
           <w:sz w:val="20"/>
         </w:rPr>
-        <w:t>針對上述三問題，本研究的構想是：與其分別修補幻覺、不穩定與缺領域規範，不如把彼此互補的三項技術整合成一套框架，讓它們各自負責一個問題又能協同運作。框架以多階段分析將審查拆解為摘要生成、初步審查、靜態分析、程式碼異味偵測與總結報告等循序步驟（思維鏈</w:t>
-      </w:r>
-      <w:r>
-        <w:rPr>
-          <w:rFonts w:eastAsia="標楷體" w:hint="eastAsia"/>
-          <w:sz w:val="20"/>
-        </w:rPr>
-        <w:t xml:space="preserve"> CoT</w:t>
-      </w:r>
-      <w:r>
-        <w:rPr>
-          <w:rFonts w:eastAsia="標楷體" w:hint="eastAsia"/>
-          <w:sz w:val="20"/>
-        </w:rPr>
-        <w:t>係一種引導模型先逐步</w:t>
-      </w:r>
-      <w:r>
-        <w:rPr>
-          <w:rFonts w:eastAsia="標楷體" w:hint="eastAsia"/>
-          <w:sz w:val="20"/>
-        </w:rPr>
-        <w:t>推理、再給出結論之提示策略，可提升模型於複雜任務上之推理品質），使每一步僅承擔單一子任務、產物逐一落檔而可追溯，以換取一致性。</w:t>
+        <w:t>針對上述</w:t>
+      </w:r>
+      <w:proofErr w:type="gramStart"/>
+      <w:r>
+        <w:rPr>
+          <w:rFonts w:eastAsia="標楷體" w:hint="eastAsia"/>
+          <w:sz w:val="20"/>
+        </w:rPr>
+        <w:t>三</w:t>
+      </w:r>
+      <w:proofErr w:type="gramEnd"/>
+      <w:r>
+        <w:rPr>
+          <w:rFonts w:eastAsia="標楷體" w:hint="eastAsia"/>
+          <w:sz w:val="20"/>
+        </w:rPr>
+        <w:t>問題，本研究的構想是：與其分別修補幻覺、不穩定與缺領域規範，不如把彼此互補的三項技術整合成一套框架，讓它們各自負責一個問題又能協同運作。框架以多階段分析將審查拆解為摘要生成、初步審查、靜態分析、程式碼異味偵測與總結報告等循序步驟（思維鏈</w:t>
+      </w:r>
+      <w:r>
+        <w:rPr>
+          <w:rFonts w:eastAsia="標楷體" w:hint="eastAsia"/>
+          <w:sz w:val="20"/>
+        </w:rPr>
+        <w:t xml:space="preserve"> </w:t>
+      </w:r>
+      <w:proofErr w:type="spellStart"/>
+      <w:r>
+        <w:rPr>
+          <w:rFonts w:eastAsia="標楷體" w:hint="eastAsia"/>
+          <w:sz w:val="20"/>
+        </w:rPr>
+        <w:t>CoT</w:t>
+      </w:r>
+      <w:proofErr w:type="spellEnd"/>
+      <w:r>
+        <w:rPr>
+          <w:rFonts w:eastAsia="標楷體" w:hint="eastAsia"/>
+          <w:sz w:val="20"/>
+        </w:rPr>
+        <w:t>係一種引導模型先逐步推理、再給出結論之提示策略，可提升模型於複雜任務上之推理品質），使</w:t>
+      </w:r>
+      <w:proofErr w:type="gramStart"/>
+      <w:r>
+        <w:rPr>
+          <w:rFonts w:eastAsia="標楷體" w:hint="eastAsia"/>
+          <w:sz w:val="20"/>
+        </w:rPr>
+        <w:t>每一步僅承擔</w:t>
+      </w:r>
+      <w:proofErr w:type="gramEnd"/>
+      <w:r>
+        <w:rPr>
+          <w:rFonts w:eastAsia="標楷體" w:hint="eastAsia"/>
+          <w:sz w:val="20"/>
+        </w:rPr>
+        <w:t>單一子任務、產物</w:t>
+      </w:r>
+      <w:proofErr w:type="gramStart"/>
+      <w:r>
+        <w:rPr>
+          <w:rFonts w:eastAsia="標楷體" w:hint="eastAsia"/>
+          <w:sz w:val="20"/>
+        </w:rPr>
+        <w:t>逐一落檔而</w:t>
+      </w:r>
+      <w:proofErr w:type="gramEnd"/>
+      <w:r>
+        <w:rPr>
+          <w:rFonts w:eastAsia="標楷體" w:hint="eastAsia"/>
+          <w:sz w:val="20"/>
+        </w:rPr>
+        <w:t>可追溯，以換取一致性。</w:t>
       </w:r>
       <w:r>
         <w:rPr>
@@ -915,21 +1103,62 @@
           <w:rFonts w:eastAsia="標楷體" w:hint="eastAsia"/>
           <w:sz w:val="20"/>
         </w:rPr>
-        <w:t>則將專案規範與領域知識在推理前注入脈絡，於不重新訓練模型之前提下抑制幻覺，以換取可解釋性。模型面採知識蒸餾結合</w:t>
-      </w:r>
-      <w:r>
-        <w:rPr>
-          <w:rFonts w:eastAsia="標楷體" w:hint="eastAsia"/>
-          <w:sz w:val="20"/>
-        </w:rPr>
-        <w:t xml:space="preserve"> QLoRA</w:t>
-      </w:r>
-      <w:r>
-        <w:rPr>
-          <w:rFonts w:eastAsia="標楷體" w:hint="eastAsia"/>
-          <w:sz w:val="20"/>
-        </w:rPr>
-        <w:t>，將教師模型之高階推理能力轉移至輕量化學生模型（</w:t>
+        <w:t>則將專案規範與領域知識在推理前注入脈絡，於不重新訓練模型之前提下抑制幻覺，以換取可解釋性。模型面</w:t>
+      </w:r>
+      <w:proofErr w:type="gramStart"/>
+      <w:r>
+        <w:rPr>
+          <w:rFonts w:eastAsia="標楷體" w:hint="eastAsia"/>
+          <w:sz w:val="20"/>
+        </w:rPr>
+        <w:t>採</w:t>
+      </w:r>
+      <w:proofErr w:type="gramEnd"/>
+      <w:r>
+        <w:rPr>
+          <w:rFonts w:eastAsia="標楷體" w:hint="eastAsia"/>
+          <w:sz w:val="20"/>
+        </w:rPr>
+        <w:t>知識蒸餾結合</w:t>
+      </w:r>
+      <w:r>
+        <w:rPr>
+          <w:rFonts w:eastAsia="標楷體" w:hint="eastAsia"/>
+          <w:sz w:val="20"/>
+        </w:rPr>
+        <w:t xml:space="preserve"> </w:t>
+      </w:r>
+      <w:proofErr w:type="spellStart"/>
+      <w:r>
+        <w:rPr>
+          <w:rFonts w:eastAsia="標楷體" w:hint="eastAsia"/>
+          <w:sz w:val="20"/>
+        </w:rPr>
+        <w:t>QLoRA</w:t>
+      </w:r>
+      <w:proofErr w:type="spellEnd"/>
+      <w:r>
+        <w:rPr>
+          <w:rFonts w:eastAsia="標楷體" w:hint="eastAsia"/>
+          <w:sz w:val="20"/>
+        </w:rPr>
+        <w:t>，將教師模型之高階推理能力</w:t>
+      </w:r>
+      <w:proofErr w:type="gramStart"/>
+      <w:r>
+        <w:rPr>
+          <w:rFonts w:eastAsia="標楷體" w:hint="eastAsia"/>
+          <w:sz w:val="20"/>
+        </w:rPr>
+        <w:t>轉移至輕量化</w:t>
+      </w:r>
+      <w:proofErr w:type="gramEnd"/>
+      <w:r>
+        <w:rPr>
+          <w:rFonts w:eastAsia="標楷體" w:hint="eastAsia"/>
+          <w:sz w:val="20"/>
+        </w:rPr>
+        <w:t>學生模型（</w:t>
       </w:r>
       <w:r>
         <w:rPr>
@@ -967,7 +1196,23 @@
           <w:rFonts w:eastAsia="標楷體" w:hint="eastAsia"/>
           <w:sz w:val="20"/>
         </w:rPr>
-        <w:t>據此，本研究之貢獻可歸納為四項。其一，多階段</w:t>
+        <w:t>據此，本研究之貢獻可歸納為四項。</w:t>
+      </w:r>
+      <w:proofErr w:type="gramStart"/>
+      <w:r>
+        <w:rPr>
+          <w:rFonts w:eastAsia="標楷體" w:hint="eastAsia"/>
+          <w:sz w:val="20"/>
+        </w:rPr>
+        <w:t>其一，</w:t>
+      </w:r>
+      <w:proofErr w:type="gramEnd"/>
+      <w:r>
+        <w:rPr>
+          <w:rFonts w:eastAsia="標楷體" w:hint="eastAsia"/>
+          <w:sz w:val="20"/>
+        </w:rPr>
+        <w:t>多階段</w:t>
       </w:r>
       <w:r>
         <w:rPr>
@@ -976,33 +1221,90 @@
         </w:rPr>
         <w:t xml:space="preserve"> </w:t>
       </w:r>
-      <w:r>
-        <w:rPr>
-          <w:rFonts w:eastAsia="標楷體" w:hint="eastAsia"/>
-          <w:sz w:val="20"/>
-        </w:rPr>
-        <w:t xml:space="preserve">CoT </w:t>
-      </w:r>
-      <w:r>
-        <w:rPr>
-          <w:rFonts w:eastAsia="標楷體" w:hint="eastAsia"/>
-          <w:sz w:val="20"/>
-        </w:rPr>
-        <w:t>審查流程，將審查任務結構化為可逐步推理且可追溯之循序步驟。其二，以知識蒸餾結合</w:t>
-      </w:r>
-      <w:r>
-        <w:rPr>
-          <w:rFonts w:eastAsia="標楷體" w:hint="eastAsia"/>
-          <w:sz w:val="20"/>
-        </w:rPr>
-        <w:t xml:space="preserve"> QLoRA </w:t>
-      </w:r>
-      <w:r>
-        <w:rPr>
-          <w:rFonts w:eastAsia="標楷體" w:hint="eastAsia"/>
-          <w:sz w:val="20"/>
-        </w:rPr>
-        <w:t>達成輕量化部署，使高品質審查能力得以於有限運算資源下落地。其三，以</w:t>
+      <w:proofErr w:type="spellStart"/>
+      <w:r>
+        <w:rPr>
+          <w:rFonts w:eastAsia="標楷體" w:hint="eastAsia"/>
+          <w:sz w:val="20"/>
+        </w:rPr>
+        <w:t>CoT</w:t>
+      </w:r>
+      <w:proofErr w:type="spellEnd"/>
+      <w:r>
+        <w:rPr>
+          <w:rFonts w:eastAsia="標楷體" w:hint="eastAsia"/>
+          <w:sz w:val="20"/>
+        </w:rPr>
+        <w:t xml:space="preserve"> </w:t>
+      </w:r>
+      <w:r>
+        <w:rPr>
+          <w:rFonts w:eastAsia="標楷體" w:hint="eastAsia"/>
+          <w:sz w:val="20"/>
+        </w:rPr>
+        <w:t>審查流程，將審查任務結構化為可逐步推理且可追溯之循序步驟。</w:t>
+      </w:r>
+      <w:proofErr w:type="gramStart"/>
+      <w:r>
+        <w:rPr>
+          <w:rFonts w:eastAsia="標楷體" w:hint="eastAsia"/>
+          <w:sz w:val="20"/>
+        </w:rPr>
+        <w:t>其二，</w:t>
+      </w:r>
+      <w:proofErr w:type="gramEnd"/>
+      <w:r>
+        <w:rPr>
+          <w:rFonts w:eastAsia="標楷體" w:hint="eastAsia"/>
+          <w:sz w:val="20"/>
+        </w:rPr>
+        <w:t>以知識蒸餾結合</w:t>
+      </w:r>
+      <w:r>
+        <w:rPr>
+          <w:rFonts w:eastAsia="標楷體" w:hint="eastAsia"/>
+          <w:sz w:val="20"/>
+        </w:rPr>
+        <w:t xml:space="preserve"> </w:t>
+      </w:r>
+      <w:proofErr w:type="spellStart"/>
+      <w:r>
+        <w:rPr>
+          <w:rFonts w:eastAsia="標楷體" w:hint="eastAsia"/>
+          <w:sz w:val="20"/>
+        </w:rPr>
+        <w:t>QLoRA</w:t>
+      </w:r>
+      <w:proofErr w:type="spellEnd"/>
+      <w:r>
+        <w:rPr>
+          <w:rFonts w:eastAsia="標楷體" w:hint="eastAsia"/>
+          <w:sz w:val="20"/>
+        </w:rPr>
+        <w:t xml:space="preserve"> </w:t>
+      </w:r>
+      <w:r>
+        <w:rPr>
+          <w:rFonts w:eastAsia="標楷體" w:hint="eastAsia"/>
+          <w:sz w:val="20"/>
+        </w:rPr>
+        <w:t>達成輕量化部署，使高品質審查能力得以於有限運算資源下落地。其</w:t>
+      </w:r>
+      <w:proofErr w:type="gramStart"/>
+      <w:r>
+        <w:rPr>
+          <w:rFonts w:eastAsia="標楷體" w:hint="eastAsia"/>
+          <w:sz w:val="20"/>
+        </w:rPr>
+        <w:t>三</w:t>
+      </w:r>
+      <w:proofErr w:type="gramEnd"/>
+      <w:r>
+        <w:rPr>
+          <w:rFonts w:eastAsia="標楷體" w:hint="eastAsia"/>
+          <w:sz w:val="20"/>
+        </w:rPr>
+        <w:t>，以</w:t>
       </w:r>
       <w:r>
         <w:rPr>
@@ -1037,14 +1339,7 @@
           <w:rFonts w:eastAsia="標楷體" w:hint="eastAsia"/>
           <w:sz w:val="20"/>
         </w:rPr>
-        <w:t xml:space="preserve"> CRSCORE</w:t>
-      </w:r>
-      <w:r>
-        <w:rPr>
-          <w:rFonts w:eastAsia="標楷體" w:hint="eastAsia"/>
-          <w:sz w:val="20"/>
-        </w:rPr>
-        <w:t xml:space="preserve">++ </w:t>
+        <w:t xml:space="preserve"> CRSCORE++ </w:t>
       </w:r>
       <w:r>
         <w:rPr>
@@ -1208,14 +1503,7 @@
           <w:rFonts w:eastAsia="標楷體" w:hint="eastAsia"/>
           <w:sz w:val="20"/>
         </w:rPr>
-        <w:t>，且審查意見之品</w:t>
-      </w:r>
-      <w:r>
-        <w:rPr>
-          <w:rFonts w:eastAsia="標楷體" w:hint="eastAsia"/>
-          <w:sz w:val="20"/>
-        </w:rPr>
-        <w:t>質會直接影響後續程式修正之成效</w:t>
+        <w:t>，且審查意見之品質會直接影響後續程式修正之成效</w:t>
       </w:r>
       <w:r>
         <w:rPr>
@@ -1399,7 +1687,23 @@
           <w:rFonts w:eastAsia="標楷體" w:hint="eastAsia"/>
           <w:sz w:val="20"/>
         </w:rPr>
-        <w:t>。在評估面，由於人工標註成本高昂，</w:t>
+        <w:t>。在評估面，由於人工標</w:t>
+      </w:r>
+      <w:proofErr w:type="gramStart"/>
+      <w:r>
+        <w:rPr>
+          <w:rFonts w:eastAsia="標楷體" w:hint="eastAsia"/>
+          <w:sz w:val="20"/>
+        </w:rPr>
+        <w:t>註</w:t>
+      </w:r>
+      <w:proofErr w:type="gramEnd"/>
+      <w:r>
+        <w:rPr>
+          <w:rFonts w:eastAsia="標楷體" w:hint="eastAsia"/>
+          <w:sz w:val="20"/>
+        </w:rPr>
+        <w:t>成本高昂，</w:t>
       </w:r>
       <w:r>
         <w:rPr>
@@ -1555,14 +1859,46 @@
           <w:rFonts w:eastAsia="標楷體" w:hint="eastAsia"/>
           <w:sz w:val="20"/>
         </w:rPr>
-        <w:t xml:space="preserve"> LoRA </w:t>
-      </w:r>
-      <w:r>
-        <w:rPr>
-          <w:rFonts w:eastAsia="標楷體" w:hint="eastAsia"/>
-          <w:sz w:val="20"/>
-        </w:rPr>
-        <w:t>透過低秩矩陣近似全參數更新，在極少參數下仍可逼近完整微調</w:t>
+        <w:t xml:space="preserve"> </w:t>
+      </w:r>
+      <w:proofErr w:type="spellStart"/>
+      <w:r>
+        <w:rPr>
+          <w:rFonts w:eastAsia="標楷體" w:hint="eastAsia"/>
+          <w:sz w:val="20"/>
+        </w:rPr>
+        <w:t>LoRA</w:t>
+      </w:r>
+      <w:proofErr w:type="spellEnd"/>
+      <w:r>
+        <w:rPr>
+          <w:rFonts w:eastAsia="標楷體" w:hint="eastAsia"/>
+          <w:sz w:val="20"/>
+        </w:rPr>
+        <w:t xml:space="preserve"> </w:t>
+      </w:r>
+      <w:r>
+        <w:rPr>
+          <w:rFonts w:eastAsia="標楷體" w:hint="eastAsia"/>
+          <w:sz w:val="20"/>
+        </w:rPr>
+        <w:t>透過低</w:t>
+      </w:r>
+      <w:proofErr w:type="gramStart"/>
+      <w:r>
+        <w:rPr>
+          <w:rFonts w:eastAsia="標楷體" w:hint="eastAsia"/>
+          <w:sz w:val="20"/>
+        </w:rPr>
+        <w:t>秩</w:t>
+      </w:r>
+      <w:proofErr w:type="gramEnd"/>
+      <w:r>
+        <w:rPr>
+          <w:rFonts w:eastAsia="標楷體" w:hint="eastAsia"/>
+          <w:sz w:val="20"/>
+        </w:rPr>
+        <w:t>矩陣近似全參數更新，在極少參數下仍可逼近完整微調</w:t>
       </w:r>
       <w:r>
         <w:rPr>
@@ -1578,12 +1914,21 @@
         </w:rPr>
         <w:t>，</w:t>
       </w:r>
-      <w:r>
-        <w:rPr>
-          <w:rFonts w:eastAsia="標楷體" w:hint="eastAsia"/>
-          <w:sz w:val="20"/>
-        </w:rPr>
-        <w:t xml:space="preserve">QLoRA </w:t>
+      <w:proofErr w:type="spellStart"/>
+      <w:r>
+        <w:rPr>
+          <w:rFonts w:eastAsia="標楷體" w:hint="eastAsia"/>
+          <w:sz w:val="20"/>
+        </w:rPr>
+        <w:t>QLoRA</w:t>
+      </w:r>
+      <w:proofErr w:type="spellEnd"/>
+      <w:r>
+        <w:rPr>
+          <w:rFonts w:eastAsia="標楷體" w:hint="eastAsia"/>
+          <w:sz w:val="20"/>
+        </w:rPr>
+        <w:t xml:space="preserve"> </w:t>
       </w:r>
       <w:r>
         <w:rPr>
@@ -1611,14 +1956,7 @@
           <w:rFonts w:eastAsia="標楷體" w:hint="eastAsia"/>
           <w:sz w:val="20"/>
         </w:rPr>
-        <w:t>Kn</w:t>
-      </w:r>
-      <w:r>
-        <w:rPr>
-          <w:rFonts w:eastAsia="標楷體" w:hint="eastAsia"/>
-          <w:sz w:val="20"/>
-        </w:rPr>
-        <w:t>owledge Distillation</w:t>
+        <w:t>Knowledge Distillation</w:t>
       </w:r>
       <w:r>
         <w:rPr>
@@ -1669,7 +2007,23 @@
           <w:rFonts w:eastAsia="標楷體" w:hint="eastAsia"/>
           <w:sz w:val="20"/>
         </w:rPr>
-        <w:t>審查多採單一提示詞架構，難以對複雜變更進行跨階段之逐步推理，致一致性受限，自動化評分雖可行，其與人類判斷之吻合度仍需交叉驗證，</w:t>
+        <w:t>審查多</w:t>
+      </w:r>
+      <w:proofErr w:type="gramStart"/>
+      <w:r>
+        <w:rPr>
+          <w:rFonts w:eastAsia="標楷體" w:hint="eastAsia"/>
+          <w:sz w:val="20"/>
+        </w:rPr>
+        <w:t>採</w:t>
+      </w:r>
+      <w:proofErr w:type="gramEnd"/>
+      <w:r>
+        <w:rPr>
+          <w:rFonts w:eastAsia="標楷體" w:hint="eastAsia"/>
+          <w:sz w:val="20"/>
+        </w:rPr>
+        <w:t>單一提示詞架構，難以對複雜變更進行跨階段之逐步推理，致一致性受限，自動化評分雖可行，其與人類判斷之吻合度仍需交叉驗證，</w:t>
       </w:r>
       <w:r>
         <w:rPr>
@@ -1690,7 +2044,23 @@
           <w:rFonts w:eastAsia="標楷體" w:hint="eastAsia"/>
           <w:sz w:val="20"/>
         </w:rPr>
-        <w:t xml:space="preserve"> CoT </w:t>
+        <w:t xml:space="preserve"> </w:t>
+      </w:r>
+      <w:proofErr w:type="spellStart"/>
+      <w:r>
+        <w:rPr>
+          <w:rFonts w:eastAsia="標楷體" w:hint="eastAsia"/>
+          <w:sz w:val="20"/>
+        </w:rPr>
+        <w:t>CoT</w:t>
+      </w:r>
+      <w:proofErr w:type="spellEnd"/>
+      <w:r>
+        <w:rPr>
+          <w:rFonts w:eastAsia="標楷體" w:hint="eastAsia"/>
+          <w:sz w:val="20"/>
+        </w:rPr>
+        <w:t xml:space="preserve"> </w:t>
       </w:r>
       <w:r>
         <w:rPr>
@@ -1718,14 +2088,23 @@
           <w:rFonts w:eastAsia="標楷體" w:hint="eastAsia"/>
           <w:sz w:val="20"/>
         </w:rPr>
-        <w:t>KD/Q</w:t>
-      </w:r>
-      <w:r>
-        <w:rPr>
-          <w:rFonts w:eastAsia="標楷體" w:hint="eastAsia"/>
-          <w:sz w:val="20"/>
-        </w:rPr>
-        <w:t xml:space="preserve">LoRA </w:t>
+        <w:t>KD/</w:t>
+      </w:r>
+      <w:proofErr w:type="spellStart"/>
+      <w:r>
+        <w:rPr>
+          <w:rFonts w:eastAsia="標楷體" w:hint="eastAsia"/>
+          <w:sz w:val="20"/>
+        </w:rPr>
+        <w:t>QLoRA</w:t>
+      </w:r>
+      <w:proofErr w:type="spellEnd"/>
+      <w:r>
+        <w:rPr>
+          <w:rFonts w:eastAsia="標楷體" w:hint="eastAsia"/>
+          <w:sz w:val="20"/>
+        </w:rPr>
+        <w:t xml:space="preserve"> </w:t>
       </w:r>
       <w:r>
         <w:rPr>
@@ -1821,14 +2200,55 @@
           <w:rFonts w:eastAsia="標楷體" w:hint="eastAsia"/>
           <w:sz w:val="20"/>
         </w:rPr>
-        <w:t>本研究將知識蒸餾與微調建構為一條管線，使較小之學生模型於有限運算資源下習得大型教師模型之審查推理能力。流程首先以具思維鏈之少樣本提示向教師大模型發出請求，使其在輸出審查結論之同時亦逐步展開中間推理步驟，從而蒸餾出結構化且帶推理軌跡之資料，而非僅有結論（教師之推理軌跡係經提示隱性產生，本研究不另建自動化教師推論管線</w:t>
-      </w:r>
-      <w:r>
-        <w:rPr>
-          <w:rFonts w:eastAsia="標楷體" w:hint="eastAsia"/>
-          <w:sz w:val="20"/>
-        </w:rPr>
-        <w:t>，亦不綁定特定教師模型編號）。其後，這些教師輸出經清洗、轉換為指令跟隨（</w:t>
+        <w:t>本研究將知識蒸餾與微調建構為一條管線，</w:t>
+      </w:r>
+      <w:proofErr w:type="gramStart"/>
+      <w:r>
+        <w:rPr>
+          <w:rFonts w:eastAsia="標楷體" w:hint="eastAsia"/>
+          <w:sz w:val="20"/>
+        </w:rPr>
+        <w:t>使較小</w:t>
+      </w:r>
+      <w:proofErr w:type="gramEnd"/>
+      <w:r>
+        <w:rPr>
+          <w:rFonts w:eastAsia="標楷體" w:hint="eastAsia"/>
+          <w:sz w:val="20"/>
+        </w:rPr>
+        <w:t>之學生模型於有限運算</w:t>
+      </w:r>
+      <w:proofErr w:type="gramStart"/>
+      <w:r>
+        <w:rPr>
+          <w:rFonts w:eastAsia="標楷體" w:hint="eastAsia"/>
+          <w:sz w:val="20"/>
+        </w:rPr>
+        <w:t>資源下習得</w:t>
+      </w:r>
+      <w:proofErr w:type="gramEnd"/>
+      <w:r>
+        <w:rPr>
+          <w:rFonts w:eastAsia="標楷體" w:hint="eastAsia"/>
+          <w:sz w:val="20"/>
+        </w:rPr>
+        <w:t>大型教師模型之審查推理能力。流程首先以具思維鏈之少樣本提示向教師大模型發出請求，使其在輸出審查結論之同時亦逐步展開中間推理步驟，從而蒸餾出結構化且帶推理軌跡之資料，而非僅有結論（教師之推理軌跡係經提示隱性產生，本研究</w:t>
+      </w:r>
+      <w:proofErr w:type="gramStart"/>
+      <w:r>
+        <w:rPr>
+          <w:rFonts w:eastAsia="標楷體" w:hint="eastAsia"/>
+          <w:sz w:val="20"/>
+        </w:rPr>
+        <w:t>不</w:t>
+      </w:r>
+      <w:proofErr w:type="gramEnd"/>
+      <w:r>
+        <w:rPr>
+          <w:rFonts w:eastAsia="標楷體" w:hint="eastAsia"/>
+          <w:sz w:val="20"/>
+        </w:rPr>
+        <w:t>另建自動化教師推論管線，亦不綁定特定教師模型編號）。其後，這些教師輸出經清洗、轉換為指令跟隨（</w:t>
       </w:r>
       <w:r>
         <w:rPr>
@@ -1870,22 +2290,56 @@
           <w:rFonts w:eastAsia="標楷體" w:hint="eastAsia"/>
           <w:sz w:val="20"/>
         </w:rPr>
-        <w:t>），使其學習教師之輸出分佈與推理模式以逼近教師效能。微調採</w:t>
-      </w:r>
-      <w:r>
-        <w:rPr>
-          <w:rFonts w:eastAsia="標楷體" w:hint="eastAsia"/>
-          <w:sz w:val="20"/>
-        </w:rPr>
-        <w:t xml:space="preserve"> QLoRA </w:t>
-      </w:r>
-      <w:r>
-        <w:rPr>
-          <w:rFonts w:eastAsia="標楷體" w:hint="eastAsia"/>
-          <w:sz w:val="20"/>
-        </w:rPr>
-        <w:t>技術：模型權重先以</w:t>
-      </w:r>
+        <w:t>），使其學習教師之輸出分佈與推理模式以逼近教師效能。微調</w:t>
+      </w:r>
+      <w:proofErr w:type="gramStart"/>
+      <w:r>
+        <w:rPr>
+          <w:rFonts w:eastAsia="標楷體" w:hint="eastAsia"/>
+          <w:sz w:val="20"/>
+        </w:rPr>
+        <w:t>採</w:t>
+      </w:r>
+      <w:proofErr w:type="gramEnd"/>
+      <w:r>
+        <w:rPr>
+          <w:rFonts w:eastAsia="標楷體" w:hint="eastAsia"/>
+          <w:sz w:val="20"/>
+        </w:rPr>
+        <w:t xml:space="preserve"> </w:t>
+      </w:r>
+      <w:proofErr w:type="spellStart"/>
+      <w:r>
+        <w:rPr>
+          <w:rFonts w:eastAsia="標楷體" w:hint="eastAsia"/>
+          <w:sz w:val="20"/>
+        </w:rPr>
+        <w:t>QLoRA</w:t>
+      </w:r>
+      <w:proofErr w:type="spellEnd"/>
+      <w:r>
+        <w:rPr>
+          <w:rFonts w:eastAsia="標楷體" w:hint="eastAsia"/>
+          <w:sz w:val="20"/>
+        </w:rPr>
+        <w:t xml:space="preserve"> </w:t>
+      </w:r>
+      <w:r>
+        <w:rPr>
+          <w:rFonts w:eastAsia="標楷體" w:hint="eastAsia"/>
+          <w:sz w:val="20"/>
+        </w:rPr>
+        <w:t>技術：模型</w:t>
+      </w:r>
+      <w:proofErr w:type="gramStart"/>
+      <w:r>
+        <w:rPr>
+          <w:rFonts w:eastAsia="標楷體" w:hint="eastAsia"/>
+          <w:sz w:val="20"/>
+        </w:rPr>
+        <w:t>權重先以</w:t>
+      </w:r>
+      <w:proofErr w:type="gramEnd"/>
       <w:r>
         <w:rPr>
           <w:rFonts w:eastAsia="標楷體" w:hint="eastAsia"/>
@@ -1898,28 +2352,62 @@
           <w:rFonts w:eastAsia="標楷體" w:hint="eastAsia"/>
           <w:sz w:val="20"/>
         </w:rPr>
-        <w:t>量化以大幅降低顯示卡記憶體佔用，再僅針對少量低秩適配器（</w:t>
-      </w:r>
-      <w:r>
-        <w:rPr>
-          <w:rFonts w:eastAsia="標楷體" w:hint="eastAsia"/>
-          <w:sz w:val="20"/>
-        </w:rPr>
-        <w:t>LoRA adapter</w:t>
-      </w:r>
-      <w:r>
-        <w:rPr>
-          <w:rFonts w:eastAsia="標楷體" w:hint="eastAsia"/>
-          <w:sz w:val="20"/>
-        </w:rPr>
-        <w:t>）參數進行更新，</w:t>
-      </w:r>
-      <w:r>
-        <w:rPr>
-          <w:rFonts w:eastAsia="標楷體" w:hint="eastAsia"/>
-          <w:sz w:val="20"/>
-        </w:rPr>
-        <w:t>使</w:t>
+        <w:t>量化以大幅降低顯示卡記憶體佔用，</w:t>
+      </w:r>
+      <w:proofErr w:type="gramStart"/>
+      <w:r>
+        <w:rPr>
+          <w:rFonts w:eastAsia="標楷體" w:hint="eastAsia"/>
+          <w:sz w:val="20"/>
+        </w:rPr>
+        <w:t>再僅針對</w:t>
+      </w:r>
+      <w:proofErr w:type="gramEnd"/>
+      <w:r>
+        <w:rPr>
+          <w:rFonts w:eastAsia="標楷體" w:hint="eastAsia"/>
+          <w:sz w:val="20"/>
+        </w:rPr>
+        <w:t>少量低</w:t>
+      </w:r>
+      <w:proofErr w:type="gramStart"/>
+      <w:r>
+        <w:rPr>
+          <w:rFonts w:eastAsia="標楷體" w:hint="eastAsia"/>
+          <w:sz w:val="20"/>
+        </w:rPr>
+        <w:t>秩</w:t>
+      </w:r>
+      <w:proofErr w:type="gramEnd"/>
+      <w:r>
+        <w:rPr>
+          <w:rFonts w:eastAsia="標楷體" w:hint="eastAsia"/>
+          <w:sz w:val="20"/>
+        </w:rPr>
+        <w:t>適配器（</w:t>
+      </w:r>
+      <w:proofErr w:type="spellStart"/>
+      <w:r>
+        <w:rPr>
+          <w:rFonts w:eastAsia="標楷體" w:hint="eastAsia"/>
+          <w:sz w:val="20"/>
+        </w:rPr>
+        <w:t>LoRA</w:t>
+      </w:r>
+      <w:proofErr w:type="spellEnd"/>
+      <w:r>
+        <w:rPr>
+          <w:rFonts w:eastAsia="標楷體" w:hint="eastAsia"/>
+          <w:sz w:val="20"/>
+        </w:rPr>
+        <w:t xml:space="preserve"> adapter</w:t>
+      </w:r>
+      <w:r>
+        <w:rPr>
+          <w:rFonts w:eastAsia="標楷體" w:hint="eastAsia"/>
+          <w:sz w:val="20"/>
+        </w:rPr>
+        <w:t>）參數進行更新，使</w:t>
       </w:r>
       <w:r>
         <w:rPr>
@@ -1977,6 +2465,7 @@
         </w:rPr>
         <w:t>之混合專家（</w:t>
       </w:r>
+      <w:proofErr w:type="spellStart"/>
       <w:r>
         <w:rPr>
           <w:rFonts w:eastAsia="標楷體" w:hint="eastAsia"/>
@@ -1984,12 +2473,29 @@
         </w:rPr>
         <w:t>MoE</w:t>
       </w:r>
-      <w:r>
-        <w:rPr>
-          <w:rFonts w:eastAsia="標楷體" w:hint="eastAsia"/>
-          <w:sz w:val="20"/>
-        </w:rPr>
-        <w:t>）結構於新版函式庫會在</w:t>
+      <w:proofErr w:type="spellEnd"/>
+      <w:r>
+        <w:rPr>
+          <w:rFonts w:eastAsia="標楷體" w:hint="eastAsia"/>
+          <w:sz w:val="20"/>
+        </w:rPr>
+        <w:t>）結構於新版</w:t>
+      </w:r>
+      <w:proofErr w:type="gramStart"/>
+      <w:r>
+        <w:rPr>
+          <w:rFonts w:eastAsia="標楷體" w:hint="eastAsia"/>
+          <w:sz w:val="20"/>
+        </w:rPr>
+        <w:t>函式庫會</w:t>
+      </w:r>
+      <w:proofErr w:type="gramEnd"/>
+      <w:r>
+        <w:rPr>
+          <w:rFonts w:eastAsia="標楷體" w:hint="eastAsia"/>
+          <w:sz w:val="20"/>
+        </w:rPr>
+        <w:t>在</w:t>
       </w:r>
       <w:r>
         <w:rPr>
@@ -2024,7 +2530,23 @@
           <w:rFonts w:eastAsia="標楷體" w:hint="eastAsia"/>
           <w:sz w:val="20"/>
         </w:rPr>
-        <w:t xml:space="preserve"> LoRA </w:t>
+        <w:t xml:space="preserve"> </w:t>
+      </w:r>
+      <w:proofErr w:type="spellStart"/>
+      <w:r>
+        <w:rPr>
+          <w:rFonts w:eastAsia="標楷體" w:hint="eastAsia"/>
+          <w:sz w:val="20"/>
+        </w:rPr>
+        <w:t>LoRA</w:t>
+      </w:r>
+      <w:proofErr w:type="spellEnd"/>
+      <w:r>
+        <w:rPr>
+          <w:rFonts w:eastAsia="標楷體" w:hint="eastAsia"/>
+          <w:sz w:val="20"/>
+        </w:rPr>
+        <w:t xml:space="preserve"> </w:t>
       </w:r>
       <w:r>
         <w:rPr>
@@ -2115,7 +2637,7 @@
       <w:pPr>
         <w:jc w:val="center"/>
         <w:rPr>
-          <w:rFonts w:eastAsia="標楷體"/>
+          <w:rFonts w:eastAsia="標楷體" w:hint="eastAsia"/>
           <w:bCs/>
           <w:sz w:val="20"/>
         </w:rPr>
@@ -2147,33 +2669,85 @@
     </w:p>
     <w:p>
       <w:pPr>
-        <w:jc w:val="center"/>
-        <w:rPr>
-          <w:rFonts w:eastAsia="標楷體" w:hint="eastAsia"/>
-          <w:bCs/>
-          <w:sz w:val="20"/>
-        </w:rPr>
-      </w:pPr>
+        <w:spacing w:before="120" w:after="60"/>
+      </w:pPr>
+      <w:r>
+        <w:rPr>
+          <w:rFonts w:eastAsia="標楷體" w:hint="eastAsia"/>
+          <w:b/>
+          <w:sz w:val="20"/>
+        </w:rPr>
+        <w:t xml:space="preserve">3.2 </w:t>
+      </w:r>
+      <w:r>
+        <w:rPr>
+          <w:rFonts w:eastAsia="標楷體" w:hint="eastAsia"/>
+          <w:b/>
+          <w:sz w:val="20"/>
+        </w:rPr>
+        <w:t>系統整體架構</w:t>
+      </w:r>
     </w:p>
     <w:p>
       <w:pPr>
-        <w:spacing w:before="120" w:after="60"/>
-      </w:pPr>
-      <w:r>
-        <w:rPr>
-          <w:rFonts w:eastAsia="標楷體" w:hint="eastAsia"/>
-          <w:b/>
-          <w:sz w:val="20"/>
-        </w:rPr>
-        <w:t xml:space="preserve">3.2 </w:t>
-      </w:r>
-      <w:r>
-        <w:rPr>
-          <w:rFonts w:eastAsia="標楷體" w:hint="eastAsia"/>
-          <w:b/>
-          <w:sz w:val="20"/>
-        </w:rPr>
-        <w:t>系統整體架構</w:t>
+        <w:jc w:val="both"/>
+        <w:rPr>
+          <w:rFonts w:eastAsia="標楷體"/>
+          <w:sz w:val="20"/>
+        </w:rPr>
+      </w:pPr>
+      <w:r>
+        <w:rPr>
+          <w:rFonts w:eastAsia="標楷體" w:hint="eastAsia"/>
+          <w:sz w:val="20"/>
+        </w:rPr>
+        <w:t>本研究提出之框架整合檢索增強生成與思維</w:t>
+      </w:r>
+      <w:proofErr w:type="gramStart"/>
+      <w:r>
+        <w:rPr>
+          <w:rFonts w:eastAsia="標楷體" w:hint="eastAsia"/>
+          <w:sz w:val="20"/>
+        </w:rPr>
+        <w:t>鏈多步推理</w:t>
+      </w:r>
+      <w:proofErr w:type="gramEnd"/>
+      <w:r>
+        <w:rPr>
+          <w:rFonts w:eastAsia="標楷體" w:hint="eastAsia"/>
+          <w:sz w:val="20"/>
+        </w:rPr>
+        <w:t>，使大型語言模型於審查過程中得參考領域知識並逐步推理。如圖</w:t>
+      </w:r>
+      <w:r>
+        <w:rPr>
+          <w:rFonts w:eastAsia="標楷體" w:hint="eastAsia"/>
+          <w:sz w:val="20"/>
+        </w:rPr>
+        <w:t xml:space="preserve"> 1 </w:t>
+      </w:r>
+      <w:r>
+        <w:rPr>
+          <w:rFonts w:eastAsia="標楷體" w:hint="eastAsia"/>
+          <w:sz w:val="20"/>
+        </w:rPr>
+        <w:t>所示，系統整體架構依職責劃分為輸入、流程編排、檢索增強、提示模板、離線訓練與推論六層，各層以明確介面相互溝通並由對應之軟體設計模式約束實作邊界，便於替換審查步驟、提示模板、檢索器或基座模型而不牽動</w:t>
+      </w:r>
+      <w:proofErr w:type="gramStart"/>
+      <w:r>
+        <w:rPr>
+          <w:rFonts w:eastAsia="標楷體" w:hint="eastAsia"/>
+          <w:sz w:val="20"/>
+        </w:rPr>
+        <w:t>其他層</w:t>
+      </w:r>
+      <w:proofErr w:type="gramEnd"/>
+      <w:r>
+        <w:rPr>
+          <w:rFonts w:eastAsia="標楷體" w:hint="eastAsia"/>
+          <w:sz w:val="20"/>
+        </w:rPr>
+        <w:t>。</w:t>
       </w:r>
     </w:p>
     <w:p>
@@ -2189,21 +2763,93 @@
           <w:rFonts w:eastAsia="標楷體" w:hint="eastAsia"/>
           <w:sz w:val="20"/>
         </w:rPr>
-        <w:t>本研究提出之框架整合檢索增強生成與思維鏈多步推理，使大型語言模型於審查過程中得參考領域知識並逐步推理。如圖</w:t>
-      </w:r>
-      <w:r>
-        <w:rPr>
-          <w:rFonts w:eastAsia="標楷體" w:hint="eastAsia"/>
-          <w:sz w:val="20"/>
-        </w:rPr>
-        <w:t xml:space="preserve"> 1 </w:t>
-      </w:r>
-      <w:r>
-        <w:rPr>
-          <w:rFonts w:eastAsia="標楷體" w:hint="eastAsia"/>
-          <w:sz w:val="20"/>
-        </w:rPr>
-        <w:t>所示，系統整體架構依職責劃分為輸入、流程編排、檢索增強、提示模板、離線訓練與推論六層，各層以明確介面相互溝通並由對應之軟體設計模式約束實作邊界，便於替換審查步驟、提示模板、檢索器或基座模型而不牽動其他層。</w:t>
+        <w:t>輸入層以</w:t>
+      </w:r>
+      <w:r>
+        <w:rPr>
+          <w:rFonts w:eastAsia="標楷體" w:hint="eastAsia"/>
+          <w:sz w:val="20"/>
+        </w:rPr>
+        <w:t xml:space="preserve"> cot.py </w:t>
+      </w:r>
+      <w:r>
+        <w:rPr>
+          <w:rFonts w:eastAsia="標楷體" w:hint="eastAsia"/>
+          <w:sz w:val="20"/>
+        </w:rPr>
+        <w:t>為框架之單一入口，啟動時載入審查模型</w:t>
+      </w:r>
+      <w:r>
+        <w:rPr>
+          <w:rFonts w:eastAsia="標楷體" w:hint="eastAsia"/>
+          <w:sz w:val="20"/>
+        </w:rPr>
+        <w:t xml:space="preserve"> Qwen3-Coder-30B</w:t>
+      </w:r>
+      <w:r>
+        <w:rPr>
+          <w:rFonts w:eastAsia="標楷體" w:hint="eastAsia"/>
+          <w:sz w:val="20"/>
+        </w:rPr>
+        <w:t>（</w:t>
+      </w:r>
+      <w:r>
+        <w:rPr>
+          <w:rFonts w:eastAsia="標楷體" w:hint="eastAsia"/>
+          <w:sz w:val="20"/>
+        </w:rPr>
+        <w:t xml:space="preserve">Alibaba </w:t>
+      </w:r>
+      <w:r>
+        <w:rPr>
+          <w:rFonts w:eastAsia="標楷體" w:hint="eastAsia"/>
+          <w:sz w:val="20"/>
+        </w:rPr>
+        <w:t>釋出之</w:t>
+      </w:r>
+      <w:r>
+        <w:rPr>
+          <w:rFonts w:eastAsia="標楷體" w:hint="eastAsia"/>
+          <w:sz w:val="20"/>
+        </w:rPr>
+        <w:t xml:space="preserve"> 30B </w:t>
+      </w:r>
+      <w:r>
+        <w:rPr>
+          <w:rFonts w:eastAsia="標楷體" w:hint="eastAsia"/>
+          <w:sz w:val="20"/>
+        </w:rPr>
+        <w:t>程式碼基礎模型）與訓練完成之</w:t>
+      </w:r>
+      <w:r>
+        <w:rPr>
+          <w:rFonts w:eastAsia="標楷體" w:hint="eastAsia"/>
+          <w:sz w:val="20"/>
+        </w:rPr>
+        <w:t xml:space="preserve"> </w:t>
+      </w:r>
+      <w:proofErr w:type="spellStart"/>
+      <w:r>
+        <w:rPr>
+          <w:rFonts w:eastAsia="標楷體" w:hint="eastAsia"/>
+          <w:sz w:val="20"/>
+        </w:rPr>
+        <w:t>LoRA</w:t>
+      </w:r>
+      <w:proofErr w:type="spellEnd"/>
+      <w:r>
+        <w:rPr>
+          <w:rFonts w:eastAsia="標楷體" w:hint="eastAsia"/>
+          <w:sz w:val="20"/>
+        </w:rPr>
+        <w:t xml:space="preserve"> </w:t>
+      </w:r>
+      <w:r>
+        <w:rPr>
+          <w:rFonts w:eastAsia="標楷體" w:hint="eastAsia"/>
+          <w:sz w:val="20"/>
+        </w:rPr>
+        <w:t>權重，依序讀取待審查之程式碼並交付後續之思維鏈管線。</w:t>
       </w:r>
     </w:p>
     <w:p>
@@ -2219,84 +2865,233 @@
           <w:rFonts w:eastAsia="標楷體" w:hint="eastAsia"/>
           <w:sz w:val="20"/>
         </w:rPr>
-        <w:t>輸入層以</w:t>
-      </w:r>
-      <w:r>
-        <w:rPr>
-          <w:rFonts w:eastAsia="標楷體" w:hint="eastAsia"/>
-          <w:sz w:val="20"/>
-        </w:rPr>
-        <w:t xml:space="preserve"> cot.py </w:t>
-      </w:r>
-      <w:r>
-        <w:rPr>
-          <w:rFonts w:eastAsia="標楷體" w:hint="eastAsia"/>
-          <w:sz w:val="20"/>
-        </w:rPr>
-        <w:t>為框架之單一入口，啟動時載入審查模型</w:t>
-      </w:r>
-      <w:r>
-        <w:rPr>
-          <w:rFonts w:eastAsia="標楷體" w:hint="eastAsia"/>
-          <w:sz w:val="20"/>
-        </w:rPr>
-        <w:t xml:space="preserve"> Qwen3-Coder-30B</w:t>
-      </w:r>
-      <w:r>
-        <w:rPr>
-          <w:rFonts w:eastAsia="標楷體" w:hint="eastAsia"/>
-          <w:sz w:val="20"/>
-        </w:rPr>
-        <w:t>（</w:t>
-      </w:r>
-      <w:r>
-        <w:rPr>
-          <w:rFonts w:eastAsia="標楷體" w:hint="eastAsia"/>
-          <w:sz w:val="20"/>
-        </w:rPr>
-        <w:t xml:space="preserve">Alibaba </w:t>
-      </w:r>
-      <w:r>
-        <w:rPr>
-          <w:rFonts w:eastAsia="標楷體" w:hint="eastAsia"/>
-          <w:sz w:val="20"/>
-        </w:rPr>
-        <w:t>釋出之</w:t>
-      </w:r>
-      <w:r>
-        <w:rPr>
-          <w:rFonts w:eastAsia="標楷體" w:hint="eastAsia"/>
-          <w:sz w:val="20"/>
-        </w:rPr>
-        <w:t xml:space="preserve"> 30B </w:t>
-      </w:r>
-      <w:r>
-        <w:rPr>
-          <w:rFonts w:eastAsia="標楷體" w:hint="eastAsia"/>
-          <w:sz w:val="20"/>
-        </w:rPr>
-        <w:t>程式碼基礎模型）與訓練完成之</w:t>
-      </w:r>
-      <w:r>
-        <w:rPr>
-          <w:rFonts w:eastAsia="標楷體" w:hint="eastAsia"/>
-          <w:sz w:val="20"/>
-        </w:rPr>
-        <w:t xml:space="preserve"> LoRA </w:t>
-      </w:r>
-      <w:r>
-        <w:rPr>
-          <w:rFonts w:eastAsia="標楷體" w:hint="eastAsia"/>
-          <w:sz w:val="20"/>
-        </w:rPr>
-        <w:t>權重，依序讀取待審查之程式碼</w:t>
-      </w:r>
-      <w:r>
-        <w:rPr>
-          <w:rFonts w:eastAsia="標楷體" w:hint="eastAsia"/>
-          <w:sz w:val="20"/>
-        </w:rPr>
-        <w:t>並交付後續之思維鏈管線。</w:t>
+        <w:t>流程編排層將程式碼審查拆解為</w:t>
+      </w:r>
+      <w:r>
+        <w:rPr>
+          <w:rFonts w:eastAsia="標楷體" w:hint="eastAsia"/>
+          <w:sz w:val="20"/>
+        </w:rPr>
+        <w:t xml:space="preserve"> </w:t>
+      </w:r>
+      <w:proofErr w:type="spellStart"/>
+      <w:r>
+        <w:rPr>
+          <w:rFonts w:eastAsia="標楷體" w:hint="eastAsia"/>
+          <w:sz w:val="20"/>
+        </w:rPr>
+        <w:t>first_summary</w:t>
+      </w:r>
+      <w:proofErr w:type="spellEnd"/>
+      <w:r>
+        <w:rPr>
+          <w:rFonts w:eastAsia="標楷體" w:hint="eastAsia"/>
+          <w:sz w:val="20"/>
+        </w:rPr>
+        <w:t>、</w:t>
+      </w:r>
+      <w:proofErr w:type="spellStart"/>
+      <w:r>
+        <w:rPr>
+          <w:rFonts w:eastAsia="標楷體" w:hint="eastAsia"/>
+          <w:sz w:val="20"/>
+        </w:rPr>
+        <w:t>first_code_review</w:t>
+      </w:r>
+      <w:proofErr w:type="spellEnd"/>
+      <w:r>
+        <w:rPr>
+          <w:rFonts w:eastAsia="標楷體" w:hint="eastAsia"/>
+          <w:sz w:val="20"/>
+        </w:rPr>
+        <w:t>、</w:t>
+      </w:r>
+      <w:r>
+        <w:rPr>
+          <w:rFonts w:eastAsia="標楷體" w:hint="eastAsia"/>
+          <w:sz w:val="20"/>
+        </w:rPr>
+        <w:t>linter</w:t>
+      </w:r>
+      <w:r>
+        <w:rPr>
+          <w:rFonts w:eastAsia="標楷體" w:hint="eastAsia"/>
+          <w:sz w:val="20"/>
+        </w:rPr>
+        <w:t>、</w:t>
+      </w:r>
+      <w:proofErr w:type="spellStart"/>
+      <w:r>
+        <w:rPr>
+          <w:rFonts w:eastAsia="標楷體" w:hint="eastAsia"/>
+          <w:sz w:val="20"/>
+        </w:rPr>
+        <w:t>code_smell</w:t>
+      </w:r>
+      <w:proofErr w:type="spellEnd"/>
+      <w:r>
+        <w:rPr>
+          <w:rFonts w:eastAsia="標楷體" w:hint="eastAsia"/>
+          <w:sz w:val="20"/>
+        </w:rPr>
+        <w:t>、</w:t>
+      </w:r>
+      <w:proofErr w:type="spellStart"/>
+      <w:r>
+        <w:rPr>
+          <w:rFonts w:eastAsia="標楷體" w:hint="eastAsia"/>
+          <w:sz w:val="20"/>
+        </w:rPr>
+        <w:t>total_summary</w:t>
+      </w:r>
+      <w:proofErr w:type="spellEnd"/>
+      <w:r>
+        <w:rPr>
+          <w:rFonts w:eastAsia="標楷體" w:hint="eastAsia"/>
+          <w:sz w:val="20"/>
+        </w:rPr>
+        <w:t xml:space="preserve"> </w:t>
+      </w:r>
+      <w:r>
+        <w:rPr>
+          <w:rFonts w:eastAsia="標楷體" w:hint="eastAsia"/>
+          <w:sz w:val="20"/>
+        </w:rPr>
+        <w:t>五個循序步驟，分別對應變更摘要、初步審查、靜態分析、異味偵測與總結。每一步驟皆透過</w:t>
+      </w:r>
+      <w:r>
+        <w:rPr>
+          <w:rFonts w:eastAsia="標楷體" w:hint="eastAsia"/>
+          <w:sz w:val="20"/>
+        </w:rPr>
+        <w:t xml:space="preserve"> </w:t>
+      </w:r>
+      <w:proofErr w:type="spellStart"/>
+      <w:r>
+        <w:rPr>
+          <w:rFonts w:eastAsia="標楷體" w:hint="eastAsia"/>
+          <w:sz w:val="20"/>
+        </w:rPr>
+        <w:t>build_global_rule_template</w:t>
+      </w:r>
+      <w:proofErr w:type="spellEnd"/>
+      <w:r>
+        <w:rPr>
+          <w:rFonts w:eastAsia="標楷體" w:hint="eastAsia"/>
+          <w:sz w:val="20"/>
+        </w:rPr>
+        <w:t xml:space="preserve"> </w:t>
+      </w:r>
+      <w:r>
+        <w:rPr>
+          <w:rFonts w:eastAsia="標楷體" w:hint="eastAsia"/>
+          <w:sz w:val="20"/>
+        </w:rPr>
+        <w:t>注入全域規則與</w:t>
+      </w:r>
+      <w:r>
+        <w:rPr>
+          <w:rFonts w:eastAsia="標楷體" w:hint="eastAsia"/>
+          <w:sz w:val="20"/>
+        </w:rPr>
+        <w:t xml:space="preserve"> RAG </w:t>
+      </w:r>
+      <w:r>
+        <w:rPr>
+          <w:rFonts w:eastAsia="標楷體" w:hint="eastAsia"/>
+          <w:sz w:val="20"/>
+        </w:rPr>
+        <w:t>檢索所得之</w:t>
+      </w:r>
+      <w:r>
+        <w:rPr>
+          <w:rFonts w:eastAsia="標楷體" w:hint="eastAsia"/>
+          <w:sz w:val="20"/>
+        </w:rPr>
+        <w:t xml:space="preserve"> top-K </w:t>
+      </w:r>
+      <w:r>
+        <w:rPr>
+          <w:rFonts w:eastAsia="標楷體" w:hint="eastAsia"/>
+          <w:sz w:val="20"/>
+        </w:rPr>
+        <w:t>規則後，送入經</w:t>
+      </w:r>
+      <w:r>
+        <w:rPr>
+          <w:rFonts w:eastAsia="標楷體" w:hint="eastAsia"/>
+          <w:sz w:val="20"/>
+        </w:rPr>
+        <w:t xml:space="preserve"> </w:t>
+      </w:r>
+      <w:proofErr w:type="spellStart"/>
+      <w:r>
+        <w:rPr>
+          <w:rFonts w:eastAsia="標楷體" w:hint="eastAsia"/>
+          <w:sz w:val="20"/>
+        </w:rPr>
+        <w:t>LoRA</w:t>
+      </w:r>
+      <w:proofErr w:type="spellEnd"/>
+      <w:r>
+        <w:rPr>
+          <w:rFonts w:eastAsia="標楷體" w:hint="eastAsia"/>
+          <w:sz w:val="20"/>
+        </w:rPr>
+        <w:t xml:space="preserve"> </w:t>
+      </w:r>
+      <w:r>
+        <w:rPr>
+          <w:rFonts w:eastAsia="標楷體" w:hint="eastAsia"/>
+          <w:sz w:val="20"/>
+        </w:rPr>
+        <w:t>微調之模型推理並即時將結果寫入對應之</w:t>
+      </w:r>
+      <w:r>
+        <w:rPr>
+          <w:rFonts w:eastAsia="標楷體" w:hint="eastAsia"/>
+          <w:sz w:val="20"/>
+        </w:rPr>
+        <w:t xml:space="preserve"> .md </w:t>
+      </w:r>
+      <w:r>
+        <w:rPr>
+          <w:rFonts w:eastAsia="標楷體" w:hint="eastAsia"/>
+          <w:sz w:val="20"/>
+        </w:rPr>
+        <w:t>檔。此一分步設計係本框架換取一致性之關鍵：以多階段降低單次提示詞之上下文負載，使模型專注於當前子任務，</w:t>
+      </w:r>
+      <w:proofErr w:type="gramStart"/>
+      <w:r>
+        <w:rPr>
+          <w:rFonts w:eastAsia="標楷體" w:hint="eastAsia"/>
+          <w:sz w:val="20"/>
+        </w:rPr>
+        <w:t>並令每步</w:t>
+      </w:r>
+      <w:proofErr w:type="gramEnd"/>
+      <w:r>
+        <w:rPr>
+          <w:rFonts w:eastAsia="標楷體" w:hint="eastAsia"/>
+          <w:sz w:val="20"/>
+        </w:rPr>
+        <w:t>產物可獨立追溯，</w:t>
+      </w:r>
+      <w:proofErr w:type="gramStart"/>
+      <w:r>
+        <w:rPr>
+          <w:rFonts w:eastAsia="標楷體" w:hint="eastAsia"/>
+          <w:sz w:val="20"/>
+        </w:rPr>
+        <w:t>確保長鏈推理</w:t>
+      </w:r>
+      <w:proofErr w:type="gramEnd"/>
+      <w:r>
+        <w:rPr>
+          <w:rFonts w:eastAsia="標楷體" w:hint="eastAsia"/>
+          <w:sz w:val="20"/>
+        </w:rPr>
+        <w:t>中途失敗亦不致遺失先前產出。</w:t>
       </w:r>
     </w:p>
     <w:p>
@@ -2312,154 +3107,88 @@
           <w:rFonts w:eastAsia="標楷體" w:hint="eastAsia"/>
           <w:sz w:val="20"/>
         </w:rPr>
-        <w:t>流程編排層將程式碼審查拆解為</w:t>
-      </w:r>
-      <w:r>
-        <w:rPr>
-          <w:rFonts w:eastAsia="標楷體" w:hint="eastAsia"/>
-          <w:sz w:val="20"/>
-        </w:rPr>
-        <w:t xml:space="preserve"> first_summary</w:t>
-      </w:r>
-      <w:r>
-        <w:rPr>
-          <w:rFonts w:eastAsia="標楷體" w:hint="eastAsia"/>
-          <w:sz w:val="20"/>
-        </w:rPr>
-        <w:t>、</w:t>
-      </w:r>
-      <w:r>
-        <w:rPr>
-          <w:rFonts w:eastAsia="標楷體" w:hint="eastAsia"/>
-          <w:sz w:val="20"/>
-        </w:rPr>
-        <w:t>first_code_review</w:t>
-      </w:r>
-      <w:r>
-        <w:rPr>
-          <w:rFonts w:eastAsia="標楷體" w:hint="eastAsia"/>
-          <w:sz w:val="20"/>
-        </w:rPr>
-        <w:t>、</w:t>
-      </w:r>
-      <w:r>
-        <w:rPr>
-          <w:rFonts w:eastAsia="標楷體" w:hint="eastAsia"/>
-          <w:sz w:val="20"/>
-        </w:rPr>
-        <w:t>linter</w:t>
-      </w:r>
-      <w:r>
-        <w:rPr>
-          <w:rFonts w:eastAsia="標楷體" w:hint="eastAsia"/>
-          <w:sz w:val="20"/>
-        </w:rPr>
-        <w:t>、</w:t>
-      </w:r>
-      <w:r>
-        <w:rPr>
-          <w:rFonts w:eastAsia="標楷體" w:hint="eastAsia"/>
-          <w:sz w:val="20"/>
-        </w:rPr>
-        <w:t>code_smell</w:t>
-      </w:r>
-      <w:r>
-        <w:rPr>
-          <w:rFonts w:eastAsia="標楷體" w:hint="eastAsia"/>
-          <w:sz w:val="20"/>
-        </w:rPr>
-        <w:t>、</w:t>
-      </w:r>
-      <w:r>
-        <w:rPr>
-          <w:rFonts w:eastAsia="標楷體" w:hint="eastAsia"/>
-          <w:sz w:val="20"/>
-        </w:rPr>
-        <w:t xml:space="preserve">total_summary </w:t>
-      </w:r>
-      <w:r>
-        <w:rPr>
-          <w:rFonts w:eastAsia="標楷體" w:hint="eastAsia"/>
-          <w:sz w:val="20"/>
-        </w:rPr>
-        <w:t>五個循序步驟，分別對應變更摘要、初步審查、靜態分析、異味偵測與總結。每一步驟皆透過</w:t>
-      </w:r>
-      <w:r>
-        <w:rPr>
-          <w:rFonts w:eastAsia="標楷體" w:hint="eastAsia"/>
-          <w:sz w:val="20"/>
-        </w:rPr>
-        <w:t xml:space="preserve"> build_global_rule_template </w:t>
-      </w:r>
-      <w:r>
-        <w:rPr>
-          <w:rFonts w:eastAsia="標楷體" w:hint="eastAsia"/>
-          <w:sz w:val="20"/>
-        </w:rPr>
-        <w:t>注入全域規則與</w:t>
-      </w:r>
-      <w:r>
-        <w:rPr>
-          <w:rFonts w:eastAsia="標楷體" w:hint="eastAsia"/>
-          <w:sz w:val="20"/>
-        </w:rPr>
-        <w:t xml:space="preserve"> RAG </w:t>
-      </w:r>
-      <w:r>
-        <w:rPr>
-          <w:rFonts w:eastAsia="標楷體" w:hint="eastAsia"/>
-          <w:sz w:val="20"/>
-        </w:rPr>
-        <w:t>檢索所得之</w:t>
-      </w:r>
-      <w:r>
-        <w:rPr>
-          <w:rFonts w:eastAsia="標楷體" w:hint="eastAsia"/>
-          <w:sz w:val="20"/>
-        </w:rPr>
-        <w:t xml:space="preserve"> top-K </w:t>
-      </w:r>
-      <w:r>
-        <w:rPr>
-          <w:rFonts w:eastAsia="標楷體" w:hint="eastAsia"/>
-          <w:sz w:val="20"/>
-        </w:rPr>
-        <w:t>規則後，送入經</w:t>
-      </w:r>
-      <w:r>
-        <w:rPr>
-          <w:rFonts w:eastAsia="標楷體" w:hint="eastAsia"/>
-          <w:sz w:val="20"/>
-        </w:rPr>
-        <w:t xml:space="preserve"> LoRA </w:t>
-      </w:r>
-      <w:r>
-        <w:rPr>
-          <w:rFonts w:eastAsia="標楷體" w:hint="eastAsia"/>
-          <w:sz w:val="20"/>
-        </w:rPr>
-        <w:t>微調之模型推理並即時將結果寫入對應之</w:t>
-      </w:r>
-      <w:r>
-        <w:rPr>
-          <w:rFonts w:eastAsia="標楷體" w:hint="eastAsia"/>
-          <w:sz w:val="20"/>
-        </w:rPr>
-        <w:t xml:space="preserve"> .md </w:t>
-      </w:r>
-      <w:r>
-        <w:rPr>
-          <w:rFonts w:eastAsia="標楷體" w:hint="eastAsia"/>
-          <w:sz w:val="20"/>
-        </w:rPr>
-        <w:t>檔。此一分步設計係本框架換取一致性之關鍵：以多階段降低單次提示詞之上下</w:t>
-      </w:r>
-      <w:r>
-        <w:rPr>
-          <w:rFonts w:eastAsia="標楷體" w:hint="eastAsia"/>
-          <w:sz w:val="20"/>
-        </w:rPr>
-        <w:t>文負載，使模型專注於當前子任務，並令每步產物可獨立追溯，確保長鏈推理中途失敗亦不致遺失先前產出。</w:t>
+        <w:t>檢索增強層與審查同步啟動。其直覺是：模型本身並不知道你專案的規範，</w:t>
+      </w:r>
+      <w:r>
+        <w:rPr>
+          <w:rFonts w:eastAsia="標楷體" w:hint="eastAsia"/>
+          <w:sz w:val="20"/>
+        </w:rPr>
+        <w:t xml:space="preserve">RAG </w:t>
+      </w:r>
+      <w:r>
+        <w:rPr>
+          <w:rFonts w:eastAsia="標楷體" w:hint="eastAsia"/>
+          <w:sz w:val="20"/>
+        </w:rPr>
+        <w:t>即在每次審查前臨時把最相關的幾條專案規則塞進提示詞，讓它照你的規範審而不用重新訓練模型。系統由</w:t>
+      </w:r>
+      <w:r>
+        <w:rPr>
+          <w:rFonts w:eastAsia="標楷體" w:hint="eastAsia"/>
+          <w:sz w:val="20"/>
+        </w:rPr>
+        <w:t xml:space="preserve"> FAISS</w:t>
+      </w:r>
+      <w:r>
+        <w:rPr>
+          <w:rFonts w:eastAsia="標楷體" w:hint="eastAsia"/>
+          <w:sz w:val="20"/>
+        </w:rPr>
+        <w:t>（</w:t>
+      </w:r>
+      <w:r>
+        <w:rPr>
+          <w:rFonts w:eastAsia="標楷體" w:hint="eastAsia"/>
+          <w:sz w:val="20"/>
+        </w:rPr>
+        <w:t xml:space="preserve">Facebook AI </w:t>
+      </w:r>
+      <w:r>
+        <w:rPr>
+          <w:rFonts w:eastAsia="標楷體" w:hint="eastAsia"/>
+          <w:sz w:val="20"/>
+        </w:rPr>
+        <w:t>釋出之向量索引庫，支援高速近似</w:t>
+      </w:r>
+      <w:proofErr w:type="gramStart"/>
+      <w:r>
+        <w:rPr>
+          <w:rFonts w:eastAsia="標楷體" w:hint="eastAsia"/>
+          <w:sz w:val="20"/>
+        </w:rPr>
+        <w:t>最</w:t>
+      </w:r>
+      <w:proofErr w:type="gramEnd"/>
+      <w:r>
+        <w:rPr>
+          <w:rFonts w:eastAsia="標楷體" w:hint="eastAsia"/>
+          <w:sz w:val="20"/>
+        </w:rPr>
+        <w:t>近鄰搜尋）依程式碼語義檢索相關之審查規則，依預設之相關性</w:t>
+      </w:r>
+      <w:proofErr w:type="gramStart"/>
+      <w:r>
+        <w:rPr>
+          <w:rFonts w:eastAsia="標楷體" w:hint="eastAsia"/>
+          <w:sz w:val="20"/>
+        </w:rPr>
+        <w:t>閾</w:t>
+      </w:r>
+      <w:proofErr w:type="gramEnd"/>
+      <w:r>
+        <w:rPr>
+          <w:rFonts w:eastAsia="標楷體" w:hint="eastAsia"/>
+          <w:sz w:val="20"/>
+        </w:rPr>
+        <w:t>值判斷其適用性，若足夠相關便注入提示詞，反之則直接進入後續審查，寧可不注</w:t>
+      </w:r>
+      <w:r>
+        <w:rPr>
+          <w:rFonts w:eastAsia="標楷體" w:hint="eastAsia"/>
+          <w:sz w:val="20"/>
+        </w:rPr>
+        <w:t>入也不以弱相關規則誤導模型。</w:t>
       </w:r>
     </w:p>
     <w:p>
@@ -2475,56 +3204,123 @@
           <w:rFonts w:eastAsia="標楷體" w:hint="eastAsia"/>
           <w:sz w:val="20"/>
         </w:rPr>
-        <w:t>檢索增強層與審查同步啟動。其直覺是：模型本身並不知道你專案的規範，</w:t>
-      </w:r>
-      <w:r>
-        <w:rPr>
-          <w:rFonts w:eastAsia="標楷體" w:hint="eastAsia"/>
-          <w:sz w:val="20"/>
-        </w:rPr>
-        <w:t xml:space="preserve">RAG </w:t>
-      </w:r>
-      <w:r>
-        <w:rPr>
-          <w:rFonts w:eastAsia="標楷體" w:hint="eastAsia"/>
-          <w:sz w:val="20"/>
-        </w:rPr>
-        <w:t>即在每次審查前臨時把最相關的幾條專案規則塞進提示詞，讓它照你的規範審而不用重新訓練模型。系統由</w:t>
-      </w:r>
-      <w:r>
-        <w:rPr>
-          <w:rFonts w:eastAsia="標楷體" w:hint="eastAsia"/>
-          <w:sz w:val="20"/>
-        </w:rPr>
-        <w:t xml:space="preserve"> FAISS</w:t>
-      </w:r>
-      <w:r>
-        <w:rPr>
-          <w:rFonts w:eastAsia="標楷體" w:hint="eastAsia"/>
-          <w:sz w:val="20"/>
-        </w:rPr>
-        <w:t>（</w:t>
-      </w:r>
-      <w:r>
-        <w:rPr>
-          <w:rFonts w:eastAsia="標楷體" w:hint="eastAsia"/>
-          <w:sz w:val="20"/>
-        </w:rPr>
-        <w:t xml:space="preserve">Facebook AI </w:t>
-      </w:r>
-      <w:r>
-        <w:rPr>
-          <w:rFonts w:eastAsia="標楷體" w:hint="eastAsia"/>
-          <w:sz w:val="20"/>
-        </w:rPr>
-        <w:t>釋出之向量索引庫，支援高速近似最近鄰搜尋）依程式碼語義檢索相關之審查規則，依預設之相關性閾值判斷其適用性，若足夠相關便</w:t>
-      </w:r>
-      <w:r>
-        <w:rPr>
-          <w:rFonts w:eastAsia="標楷體" w:hint="eastAsia"/>
-          <w:sz w:val="20"/>
-        </w:rPr>
-        <w:t>注入提示詞，反之則直接進入後續審查，寧可不注入也不以弱相關規則誤導模型。</w:t>
+        <w:t>提示</w:t>
+      </w:r>
+      <w:proofErr w:type="gramStart"/>
+      <w:r>
+        <w:rPr>
+          <w:rFonts w:eastAsia="標楷體" w:hint="eastAsia"/>
+          <w:sz w:val="20"/>
+        </w:rPr>
+        <w:t>模板層依當前</w:t>
+      </w:r>
+      <w:proofErr w:type="gramEnd"/>
+      <w:r>
+        <w:rPr>
+          <w:rFonts w:eastAsia="標楷體" w:hint="eastAsia"/>
+          <w:sz w:val="20"/>
+        </w:rPr>
+        <w:t>審查步驟構建對應之英文提示詞範本，並由</w:t>
+      </w:r>
+      <w:r>
+        <w:rPr>
+          <w:rFonts w:eastAsia="標楷體" w:hint="eastAsia"/>
+          <w:sz w:val="20"/>
+        </w:rPr>
+        <w:t xml:space="preserve"> </w:t>
+      </w:r>
+      <w:proofErr w:type="spellStart"/>
+      <w:r>
+        <w:rPr>
+          <w:rFonts w:eastAsia="標楷體" w:hint="eastAsia"/>
+          <w:sz w:val="20"/>
+        </w:rPr>
+        <w:t>global_rule</w:t>
+      </w:r>
+      <w:proofErr w:type="spellEnd"/>
+      <w:r>
+        <w:rPr>
+          <w:rFonts w:eastAsia="標楷體" w:hint="eastAsia"/>
+          <w:sz w:val="20"/>
+        </w:rPr>
+        <w:t xml:space="preserve"> </w:t>
+      </w:r>
+      <w:r>
+        <w:rPr>
+          <w:rFonts w:eastAsia="標楷體" w:hint="eastAsia"/>
+          <w:sz w:val="20"/>
+        </w:rPr>
+        <w:t>模板統一包入</w:t>
+      </w:r>
+      <w:r>
+        <w:rPr>
+          <w:rFonts w:eastAsia="標楷體" w:hint="eastAsia"/>
+          <w:sz w:val="20"/>
+        </w:rPr>
+        <w:t xml:space="preserve"> 7 </w:t>
+      </w:r>
+      <w:r>
+        <w:rPr>
+          <w:rFonts w:eastAsia="標楷體" w:hint="eastAsia"/>
+          <w:sz w:val="20"/>
+        </w:rPr>
+        <w:t>條全域審查準則（涵蓋可讀性與一致性、命名、軟體工程原則、邏輯與正確性、效能與安全、文件與測試、評分與回饋風格）作為共同前綴。唯有當</w:t>
+      </w:r>
+      <w:r>
+        <w:rPr>
+          <w:rFonts w:eastAsia="標楷體" w:hint="eastAsia"/>
+          <w:sz w:val="20"/>
+        </w:rPr>
+        <w:t xml:space="preserve"> RAG </w:t>
+      </w:r>
+      <w:r>
+        <w:rPr>
+          <w:rFonts w:eastAsia="標楷體" w:hint="eastAsia"/>
+          <w:sz w:val="20"/>
+        </w:rPr>
+        <w:t>層檢索到足夠相關之規則時，才再將其動態嵌入為條件式之第</w:t>
+      </w:r>
+      <w:r>
+        <w:rPr>
+          <w:rFonts w:eastAsia="標楷體" w:hint="eastAsia"/>
+          <w:sz w:val="20"/>
+        </w:rPr>
+        <w:t xml:space="preserve"> 8 </w:t>
+      </w:r>
+      <w:r>
+        <w:rPr>
+          <w:rFonts w:eastAsia="標楷體" w:hint="eastAsia"/>
+          <w:sz w:val="20"/>
+        </w:rPr>
+        <w:t>條準則，亦即全域準則固定為</w:t>
+      </w:r>
+      <w:r>
+        <w:rPr>
+          <w:rFonts w:eastAsia="標楷體" w:hint="eastAsia"/>
+          <w:sz w:val="20"/>
+        </w:rPr>
+        <w:t xml:space="preserve"> 7 </w:t>
+      </w:r>
+      <w:r>
+        <w:rPr>
+          <w:rFonts w:eastAsia="標楷體" w:hint="eastAsia"/>
+          <w:sz w:val="20"/>
+        </w:rPr>
+        <w:t>條靜態規則，第</w:t>
+      </w:r>
+      <w:r>
+        <w:rPr>
+          <w:rFonts w:eastAsia="標楷體" w:hint="eastAsia"/>
+          <w:sz w:val="20"/>
+        </w:rPr>
+        <w:t xml:space="preserve"> 8 </w:t>
+      </w:r>
+      <w:r>
+        <w:rPr>
+          <w:rFonts w:eastAsia="標楷體" w:hint="eastAsia"/>
+          <w:sz w:val="20"/>
+        </w:rPr>
+        <w:t>條僅於檢索命中時出現。如此使外部領域知識不重新訓練模型即融入推理脈絡，並隨規則文件更新而即時調整。</w:t>
       </w:r>
     </w:p>
     <w:p>
@@ -2540,113 +3336,6 @@
           <w:rFonts w:eastAsia="標楷體" w:hint="eastAsia"/>
           <w:sz w:val="20"/>
         </w:rPr>
-        <w:t>提示模板層依當前審查步驟構建對應之英文提示詞範本，並由</w:t>
-      </w:r>
-      <w:r>
-        <w:rPr>
-          <w:rFonts w:eastAsia="標楷體" w:hint="eastAsia"/>
-          <w:sz w:val="20"/>
-        </w:rPr>
-        <w:t xml:space="preserve"> global_rule </w:t>
-      </w:r>
-      <w:r>
-        <w:rPr>
-          <w:rFonts w:eastAsia="標楷體" w:hint="eastAsia"/>
-          <w:sz w:val="20"/>
-        </w:rPr>
-        <w:t>模板統一包入</w:t>
-      </w:r>
-      <w:r>
-        <w:rPr>
-          <w:rFonts w:eastAsia="標楷體" w:hint="eastAsia"/>
-          <w:sz w:val="20"/>
-        </w:rPr>
-        <w:t xml:space="preserve"> 7 </w:t>
-      </w:r>
-      <w:r>
-        <w:rPr>
-          <w:rFonts w:eastAsia="標楷體" w:hint="eastAsia"/>
-          <w:sz w:val="20"/>
-        </w:rPr>
-        <w:t>條全域審查準則（涵蓋可讀性與一致性、命名、軟體工程原則、邏輯與正確性、效能與安全、文件與測試、評分與回饋風格）作為共同前綴。唯有當</w:t>
-      </w:r>
-      <w:r>
-        <w:rPr>
-          <w:rFonts w:eastAsia="標楷體" w:hint="eastAsia"/>
-          <w:sz w:val="20"/>
-        </w:rPr>
-        <w:t xml:space="preserve"> RAG </w:t>
-      </w:r>
-      <w:r>
-        <w:rPr>
-          <w:rFonts w:eastAsia="標楷體" w:hint="eastAsia"/>
-          <w:sz w:val="20"/>
-        </w:rPr>
-        <w:t>層檢索到足夠相關之規則時，才再將其動態嵌入為條件式之第</w:t>
-      </w:r>
-      <w:r>
-        <w:rPr>
-          <w:rFonts w:eastAsia="標楷體" w:hint="eastAsia"/>
-          <w:sz w:val="20"/>
-        </w:rPr>
-        <w:t xml:space="preserve"> 8 </w:t>
-      </w:r>
-      <w:r>
-        <w:rPr>
-          <w:rFonts w:eastAsia="標楷體" w:hint="eastAsia"/>
-          <w:sz w:val="20"/>
-        </w:rPr>
-        <w:t>條準則，亦即全域準則固</w:t>
-      </w:r>
-      <w:r>
-        <w:rPr>
-          <w:rFonts w:eastAsia="標楷體" w:hint="eastAsia"/>
-          <w:sz w:val="20"/>
-        </w:rPr>
-        <w:t>定為</w:t>
-      </w:r>
-      <w:r>
-        <w:rPr>
-          <w:rFonts w:eastAsia="標楷體" w:hint="eastAsia"/>
-          <w:sz w:val="20"/>
-        </w:rPr>
-        <w:t xml:space="preserve"> 7 </w:t>
-      </w:r>
-      <w:r>
-        <w:rPr>
-          <w:rFonts w:eastAsia="標楷體" w:hint="eastAsia"/>
-          <w:sz w:val="20"/>
-        </w:rPr>
-        <w:t>條靜態規則，第</w:t>
-      </w:r>
-      <w:r>
-        <w:rPr>
-          <w:rFonts w:eastAsia="標楷體" w:hint="eastAsia"/>
-          <w:sz w:val="20"/>
-        </w:rPr>
-        <w:t xml:space="preserve"> 8 </w:t>
-      </w:r>
-      <w:r>
-        <w:rPr>
-          <w:rFonts w:eastAsia="標楷體" w:hint="eastAsia"/>
-          <w:sz w:val="20"/>
-        </w:rPr>
-        <w:t>條僅於檢索命中時出現。如此使外部領域知識不重新訓練模型即融入推理脈絡，並隨規則文件更新而即時調整。</w:t>
-      </w:r>
-    </w:p>
-    <w:p>
-      <w:pPr>
-        <w:jc w:val="both"/>
-        <w:rPr>
-          <w:rFonts w:eastAsia="標楷體"/>
-          <w:sz w:val="20"/>
-        </w:rPr>
-      </w:pPr>
-      <w:r>
-        <w:rPr>
-          <w:rFonts w:eastAsia="標楷體" w:hint="eastAsia"/>
-          <w:sz w:val="20"/>
-        </w:rPr>
         <w:t>離線訓練層即</w:t>
       </w:r>
       <w:r>
@@ -2682,7 +3371,23 @@
           <w:rFonts w:eastAsia="標楷體" w:hint="eastAsia"/>
           <w:sz w:val="20"/>
         </w:rPr>
-        <w:t xml:space="preserve"> LoRA </w:t>
+        <w:t xml:space="preserve"> </w:t>
+      </w:r>
+      <w:proofErr w:type="spellStart"/>
+      <w:r>
+        <w:rPr>
+          <w:rFonts w:eastAsia="標楷體" w:hint="eastAsia"/>
+          <w:sz w:val="20"/>
+        </w:rPr>
+        <w:t>LoRA</w:t>
+      </w:r>
+      <w:proofErr w:type="spellEnd"/>
+      <w:r>
+        <w:rPr>
+          <w:rFonts w:eastAsia="標楷體" w:hint="eastAsia"/>
+          <w:sz w:val="20"/>
+        </w:rPr>
+        <w:t xml:space="preserve"> </w:t>
       </w:r>
       <w:r>
         <w:rPr>
@@ -2703,7 +3408,71 @@
           <w:rFonts w:eastAsia="標楷體" w:hint="eastAsia"/>
           <w:sz w:val="20"/>
         </w:rPr>
-        <w:t>所示），於有限運算資源下使較小規模之學生模型習得教師模型於程式碼審查任務上之推理能力，並產出供推論層載入之輕量化審查模型，此層於系統上線前完成，與線上之逐步審查解耦。</w:t>
+        <w:t>所示），於有限運算資源</w:t>
+      </w:r>
+      <w:proofErr w:type="gramStart"/>
+      <w:r>
+        <w:rPr>
+          <w:rFonts w:eastAsia="標楷體" w:hint="eastAsia"/>
+          <w:sz w:val="20"/>
+        </w:rPr>
+        <w:t>下使較小規模</w:t>
+      </w:r>
+      <w:proofErr w:type="gramEnd"/>
+      <w:r>
+        <w:rPr>
+          <w:rFonts w:eastAsia="標楷體" w:hint="eastAsia"/>
+          <w:sz w:val="20"/>
+        </w:rPr>
+        <w:t>之學生模型習得教師模型於程式碼審查任務上之推理能力，並產出供推論層載入之輕量化審查模型，</w:t>
+      </w:r>
+      <w:proofErr w:type="gramStart"/>
+      <w:r>
+        <w:rPr>
+          <w:rFonts w:eastAsia="標楷體" w:hint="eastAsia"/>
+          <w:sz w:val="20"/>
+        </w:rPr>
+        <w:t>此層於</w:t>
+      </w:r>
+      <w:proofErr w:type="gramEnd"/>
+      <w:r>
+        <w:rPr>
+          <w:rFonts w:eastAsia="標楷體" w:hint="eastAsia"/>
+          <w:sz w:val="20"/>
+        </w:rPr>
+        <w:t>系統上線前完成，</w:t>
+      </w:r>
+      <w:proofErr w:type="gramStart"/>
+      <w:r>
+        <w:rPr>
+          <w:rFonts w:eastAsia="標楷體" w:hint="eastAsia"/>
+          <w:sz w:val="20"/>
+        </w:rPr>
+        <w:t>與線上之</w:t>
+      </w:r>
+      <w:proofErr w:type="gramEnd"/>
+      <w:r>
+        <w:rPr>
+          <w:rFonts w:eastAsia="標楷體" w:hint="eastAsia"/>
+          <w:sz w:val="20"/>
+        </w:rPr>
+        <w:t>逐步審查解</w:t>
+      </w:r>
+      <w:proofErr w:type="gramStart"/>
+      <w:r>
+        <w:rPr>
+          <w:rFonts w:eastAsia="標楷體" w:hint="eastAsia"/>
+          <w:sz w:val="20"/>
+        </w:rPr>
+        <w:t>耦</w:t>
+      </w:r>
+      <w:proofErr w:type="gramEnd"/>
+      <w:r>
+        <w:rPr>
+          <w:rFonts w:eastAsia="標楷體" w:hint="eastAsia"/>
+          <w:sz w:val="20"/>
+        </w:rPr>
+        <w:t>。</w:t>
       </w:r>
     </w:p>
     <w:p>
@@ -2815,14 +3584,62 @@
           <w:rFonts w:eastAsia="標楷體" w:hint="eastAsia"/>
           <w:sz w:val="20"/>
         </w:rPr>
-        <w:t>推論層將構建完成之提示詞送入經</w:t>
-      </w:r>
-      <w:r>
-        <w:rPr>
-          <w:rFonts w:eastAsia="標楷體" w:hint="eastAsia"/>
-          <w:sz w:val="20"/>
-        </w:rPr>
-        <w:t xml:space="preserve"> LoRA </w:t>
+        <w:t>推論</w:t>
+      </w:r>
+      <w:proofErr w:type="gramStart"/>
+      <w:r>
+        <w:rPr>
+          <w:rFonts w:eastAsia="標楷體" w:hint="eastAsia"/>
+          <w:sz w:val="20"/>
+        </w:rPr>
+        <w:t>層將構建</w:t>
+      </w:r>
+      <w:proofErr w:type="gramEnd"/>
+      <w:r>
+        <w:rPr>
+          <w:rFonts w:eastAsia="標楷體" w:hint="eastAsia"/>
+          <w:sz w:val="20"/>
+        </w:rPr>
+        <w:t>完成之</w:t>
+      </w:r>
+      <w:proofErr w:type="gramStart"/>
+      <w:r>
+        <w:rPr>
+          <w:rFonts w:eastAsia="標楷體" w:hint="eastAsia"/>
+          <w:sz w:val="20"/>
+        </w:rPr>
+        <w:t>提示詞送入</w:t>
+      </w:r>
+      <w:proofErr w:type="gramEnd"/>
+      <w:r>
+        <w:rPr>
+          <w:rFonts w:eastAsia="標楷體" w:hint="eastAsia"/>
+          <w:sz w:val="20"/>
+        </w:rPr>
+        <w:t>經</w:t>
+      </w:r>
+      <w:r>
+        <w:rPr>
+          <w:rFonts w:eastAsia="標楷體" w:hint="eastAsia"/>
+          <w:sz w:val="20"/>
+        </w:rPr>
+        <w:t xml:space="preserve"> </w:t>
+      </w:r>
+      <w:proofErr w:type="spellStart"/>
+      <w:r>
+        <w:rPr>
+          <w:rFonts w:eastAsia="標楷體" w:hint="eastAsia"/>
+          <w:sz w:val="20"/>
+        </w:rPr>
+        <w:t>LoRA</w:t>
+      </w:r>
+      <w:proofErr w:type="spellEnd"/>
+      <w:r>
+        <w:rPr>
+          <w:rFonts w:eastAsia="標楷體" w:hint="eastAsia"/>
+          <w:sz w:val="20"/>
+        </w:rPr>
+        <w:t xml:space="preserve"> </w:t>
       </w:r>
       <w:r>
         <w:rPr>
@@ -2852,26 +3669,99 @@
         </w:rPr>
         <w:t xml:space="preserve"> </w:t>
       </w:r>
-      <w:r>
-        <w:rPr>
-          <w:rFonts w:eastAsia="標楷體" w:hint="eastAsia"/>
-          <w:sz w:val="20"/>
-        </w:rPr>
-        <w:t xml:space="preserve">CoT </w:t>
-      </w:r>
-      <w:r>
-        <w:rPr>
-          <w:rFonts w:eastAsia="標楷體" w:hint="eastAsia"/>
-          <w:sz w:val="20"/>
-        </w:rPr>
-        <w:t>流程是否結束：若尚未結束，當前結果回饋至下一輪提示詞之構建，使後續步驟延續前序之推理脈絡，形成多步漸進之審查鏈，若已全部完成，則將各步輸出注入</w:t>
-      </w:r>
-      <w:r>
-        <w:rPr>
-          <w:rFonts w:eastAsia="標楷體" w:hint="eastAsia"/>
-          <w:sz w:val="20"/>
-        </w:rPr>
-        <w:t xml:space="preserve"> total_summary </w:t>
+      <w:proofErr w:type="spellStart"/>
+      <w:r>
+        <w:rPr>
+          <w:rFonts w:eastAsia="標楷體" w:hint="eastAsia"/>
+          <w:sz w:val="20"/>
+        </w:rPr>
+        <w:t>CoT</w:t>
+      </w:r>
+      <w:proofErr w:type="spellEnd"/>
+      <w:r>
+        <w:rPr>
+          <w:rFonts w:eastAsia="標楷體" w:hint="eastAsia"/>
+          <w:sz w:val="20"/>
+        </w:rPr>
+        <w:t xml:space="preserve"> </w:t>
+      </w:r>
+      <w:r>
+        <w:rPr>
+          <w:rFonts w:eastAsia="標楷體" w:hint="eastAsia"/>
+          <w:sz w:val="20"/>
+        </w:rPr>
+        <w:t>流程是否結束：若尚未結束，當前結果回饋至下一輪提示</w:t>
+      </w:r>
+      <w:proofErr w:type="gramStart"/>
+      <w:r>
+        <w:rPr>
+          <w:rFonts w:eastAsia="標楷體" w:hint="eastAsia"/>
+          <w:sz w:val="20"/>
+        </w:rPr>
+        <w:t>詞之構建</w:t>
+      </w:r>
+      <w:proofErr w:type="gramEnd"/>
+      <w:r>
+        <w:rPr>
+          <w:rFonts w:eastAsia="標楷體" w:hint="eastAsia"/>
+          <w:sz w:val="20"/>
+        </w:rPr>
+        <w:t>，使後續步驟</w:t>
+      </w:r>
+      <w:proofErr w:type="gramStart"/>
+      <w:r>
+        <w:rPr>
+          <w:rFonts w:eastAsia="標楷體" w:hint="eastAsia"/>
+          <w:sz w:val="20"/>
+        </w:rPr>
+        <w:t>延續前序之</w:t>
+      </w:r>
+      <w:proofErr w:type="gramEnd"/>
+      <w:r>
+        <w:rPr>
+          <w:rFonts w:eastAsia="標楷體" w:hint="eastAsia"/>
+          <w:sz w:val="20"/>
+        </w:rPr>
+        <w:t>推理脈絡，</w:t>
+      </w:r>
+      <w:proofErr w:type="gramStart"/>
+      <w:r>
+        <w:rPr>
+          <w:rFonts w:eastAsia="標楷體" w:hint="eastAsia"/>
+          <w:sz w:val="20"/>
+        </w:rPr>
+        <w:t>形成多步漸進</w:t>
+      </w:r>
+      <w:proofErr w:type="gramEnd"/>
+      <w:r>
+        <w:rPr>
+          <w:rFonts w:eastAsia="標楷體" w:hint="eastAsia"/>
+          <w:sz w:val="20"/>
+        </w:rPr>
+        <w:t>之審查鏈，若已全部完成，則將各步輸出注入</w:t>
+      </w:r>
+      <w:r>
+        <w:rPr>
+          <w:rFonts w:eastAsia="標楷體" w:hint="eastAsia"/>
+          <w:sz w:val="20"/>
+        </w:rPr>
+        <w:t xml:space="preserve"> </w:t>
+      </w:r>
+      <w:proofErr w:type="spellStart"/>
+      <w:r>
+        <w:rPr>
+          <w:rFonts w:eastAsia="標楷體" w:hint="eastAsia"/>
+          <w:sz w:val="20"/>
+        </w:rPr>
+        <w:t>total_summary</w:t>
+      </w:r>
+      <w:proofErr w:type="spellEnd"/>
+      <w:r>
+        <w:rPr>
+          <w:rFonts w:eastAsia="標楷體" w:hint="eastAsia"/>
+          <w:sz w:val="20"/>
+        </w:rPr>
+        <w:t xml:space="preserve"> </w:t>
       </w:r>
       <w:r>
         <w:rPr>
@@ -2899,23 +3789,55 @@
       <w:pPr>
         <w:jc w:val="both"/>
         <w:rPr>
-          <w:rFonts w:eastAsia="標楷體" w:hint="eastAsia"/>
-          <w:sz w:val="20"/>
-        </w:rPr>
-      </w:pPr>
-      <w:r>
-        <w:rPr>
-          <w:rFonts w:eastAsia="標楷體" w:hint="eastAsia"/>
-          <w:sz w:val="20"/>
-        </w:rPr>
-        <w:t>除上述核心審查流程外，隨附之開源框架另實作多項工程設計並已實際部署運作。框架以</w:t>
-      </w:r>
-      <w:r>
-        <w:rPr>
-          <w:rFonts w:eastAsia="標楷體" w:hint="eastAsia"/>
-          <w:sz w:val="20"/>
-        </w:rPr>
-        <w:t xml:space="preserve"> JudgeStep </w:t>
+          <w:rFonts w:eastAsia="標楷體"/>
+          <w:sz w:val="20"/>
+        </w:rPr>
+      </w:pPr>
+      <w:r>
+        <w:rPr>
+          <w:rFonts w:eastAsia="標楷體" w:hint="eastAsia"/>
+          <w:sz w:val="20"/>
+        </w:rPr>
+        <w:t>除上述核心審查流程外，隨附之開源</w:t>
+      </w:r>
+      <w:proofErr w:type="gramStart"/>
+      <w:r>
+        <w:rPr>
+          <w:rFonts w:eastAsia="標楷體" w:hint="eastAsia"/>
+          <w:sz w:val="20"/>
+        </w:rPr>
+        <w:t>框架另實作</w:t>
+      </w:r>
+      <w:proofErr w:type="gramEnd"/>
+      <w:r>
+        <w:rPr>
+          <w:rFonts w:eastAsia="標楷體" w:hint="eastAsia"/>
+          <w:sz w:val="20"/>
+        </w:rPr>
+        <w:t>多項工程設計並已實際部署運作。框架以</w:t>
+      </w:r>
+      <w:r>
+        <w:rPr>
+          <w:rFonts w:eastAsia="標楷體" w:hint="eastAsia"/>
+          <w:sz w:val="20"/>
+        </w:rPr>
+        <w:t xml:space="preserve"> </w:t>
+      </w:r>
+      <w:proofErr w:type="spellStart"/>
+      <w:r>
+        <w:rPr>
+          <w:rFonts w:eastAsia="標楷體" w:hint="eastAsia"/>
+          <w:sz w:val="20"/>
+        </w:rPr>
+        <w:t>JudgeStep</w:t>
+      </w:r>
+      <w:proofErr w:type="spellEnd"/>
+      <w:r>
+        <w:rPr>
+          <w:rFonts w:eastAsia="標楷體" w:hint="eastAsia"/>
+          <w:sz w:val="20"/>
+        </w:rPr>
+        <w:t xml:space="preserve"> </w:t>
       </w:r>
       <w:r>
         <w:rPr>
@@ -2957,14 +3879,7 @@
           <w:rFonts w:eastAsia="標楷體" w:hint="eastAsia"/>
           <w:sz w:val="20"/>
         </w:rPr>
-        <w:t>APPROVE / REQUEST_CHAN</w:t>
-      </w:r>
-      <w:r>
-        <w:rPr>
-          <w:rFonts w:eastAsia="標楷體" w:hint="eastAsia"/>
-          <w:sz w:val="20"/>
-        </w:rPr>
-        <w:t>GES / COMMENT</w:t>
+        <w:t>APPROVE / REQUEST_CHANGES / COMMENT</w:t>
       </w:r>
       <w:r>
         <w:rPr>
@@ -3006,8 +3921,17 @@
           <w:rFonts w:eastAsia="標楷體" w:hint="eastAsia"/>
           <w:sz w:val="20"/>
         </w:rPr>
-        <w:t xml:space="preserve"> FastAPI</w:t>
-      </w:r>
+        <w:t xml:space="preserve"> </w:t>
+      </w:r>
+      <w:proofErr w:type="spellStart"/>
+      <w:r>
+        <w:rPr>
+          <w:rFonts w:eastAsia="標楷體" w:hint="eastAsia"/>
+          <w:sz w:val="20"/>
+        </w:rPr>
+        <w:t>FastAPI</w:t>
+      </w:r>
+      <w:proofErr w:type="spellEnd"/>
       <w:r>
         <w:rPr>
           <w:rFonts w:eastAsia="標楷體" w:hint="eastAsia"/>
@@ -3015,12 +3939,42 @@
         </w:rPr>
         <w:t>、</w:t>
       </w:r>
-      <w:r>
-        <w:rPr>
-          <w:rFonts w:eastAsia="標楷體" w:hint="eastAsia"/>
-          <w:sz w:val="20"/>
-        </w:rPr>
-        <w:t>OpenAI-</w:t>
+      <w:proofErr w:type="spellStart"/>
+      <w:r>
+        <w:rPr>
+          <w:rFonts w:eastAsia="標楷體" w:hint="eastAsia"/>
+          <w:sz w:val="20"/>
+        </w:rPr>
+        <w:t>OpenAI</w:t>
+      </w:r>
+      <w:proofErr w:type="spellEnd"/>
+      <w:r>
+        <w:rPr>
+          <w:rFonts w:eastAsia="標楷體" w:hint="eastAsia"/>
+          <w:sz w:val="20"/>
+        </w:rPr>
+        <w:t>-</w:t>
+      </w:r>
+      <w:r>
+        <w:rPr>
+          <w:rFonts w:eastAsia="標楷體" w:hint="eastAsia"/>
+          <w:sz w:val="20"/>
+        </w:rPr>
+        <w:t>相容端點與</w:t>
+      </w:r>
+      <w:r>
+        <w:rPr>
+          <w:rFonts w:eastAsia="標楷體" w:hint="eastAsia"/>
+          <w:sz w:val="20"/>
+        </w:rPr>
+        <w:t xml:space="preserve"> Anthropic </w:t>
+      </w:r>
+      <w:r>
+        <w:rPr>
+          <w:rFonts w:eastAsia="標楷體" w:hint="eastAsia"/>
+          <w:sz w:val="20"/>
+        </w:rPr>
+        <w:t>等四類可替換之推論後端，</w:t>
       </w:r>
       <w:r>
         <w:rPr>
@@ -3028,21 +3982,7 @@
           <w:sz w:val="20"/>
         </w:rPr>
         <w:lastRenderedPageBreak/>
-        <w:t>相容端點與</w:t>
-      </w:r>
-      <w:r>
-        <w:rPr>
-          <w:rFonts w:eastAsia="標楷體" w:hint="eastAsia"/>
-          <w:sz w:val="20"/>
-        </w:rPr>
-        <w:t xml:space="preserve"> Anthropic </w:t>
-      </w:r>
-      <w:r>
-        <w:rPr>
-          <w:rFonts w:eastAsia="標楷體" w:hint="eastAsia"/>
-          <w:sz w:val="20"/>
-        </w:rPr>
-        <w:t>等四類可替換之推論後端，且已整合至</w:t>
+        <w:t>且已整合至</w:t>
       </w:r>
       <w:r>
         <w:rPr>
@@ -3147,7 +4087,72 @@
           <w:rFonts w:eastAsia="標楷體" w:hint="eastAsia"/>
           <w:sz w:val="20"/>
         </w:rPr>
-        <w:t xml:space="preserve"> MCP</w:t>
+        <w:t xml:space="preserve"> MCP </w:t>
+      </w:r>
+      <w:r>
+        <w:rPr>
+          <w:rFonts w:eastAsia="標楷體" w:hint="eastAsia"/>
+          <w:sz w:val="20"/>
+        </w:rPr>
+        <w:t>與</w:t>
+      </w:r>
+      <w:r>
+        <w:rPr>
+          <w:rFonts w:eastAsia="標楷體" w:hint="eastAsia"/>
+          <w:sz w:val="20"/>
+        </w:rPr>
+        <w:t xml:space="preserve"> pre-commit </w:t>
+      </w:r>
+      <w:r>
+        <w:rPr>
+          <w:rFonts w:eastAsia="標楷體" w:hint="eastAsia"/>
+          <w:sz w:val="20"/>
+        </w:rPr>
+        <w:t>兩條路徑為限，未另行開發專屬編輯器外掛）。框架</w:t>
+      </w:r>
+      <w:proofErr w:type="gramStart"/>
+      <w:r>
+        <w:rPr>
+          <w:rFonts w:eastAsia="標楷體" w:hint="eastAsia"/>
+          <w:sz w:val="20"/>
+        </w:rPr>
+        <w:t>並另實作</w:t>
+      </w:r>
+      <w:proofErr w:type="gramEnd"/>
+      <w:r>
+        <w:rPr>
+          <w:rFonts w:eastAsia="標楷體" w:hint="eastAsia"/>
+          <w:sz w:val="20"/>
+        </w:rPr>
+        <w:t>十七項研究級擴充機制（如</w:t>
+      </w:r>
+      <w:r>
+        <w:rPr>
+          <w:rFonts w:eastAsia="標楷體" w:hint="eastAsia"/>
+          <w:sz w:val="20"/>
+        </w:rPr>
+        <w:t xml:space="preserve"> prompt-injection robustness</w:t>
+      </w:r>
+      <w:r>
+        <w:rPr>
+          <w:rFonts w:eastAsia="標楷體" w:hint="eastAsia"/>
+          <w:sz w:val="20"/>
+        </w:rPr>
+        <w:t>、多輪對話審查與</w:t>
+      </w:r>
+      <w:r>
+        <w:rPr>
+          <w:rFonts w:eastAsia="標楷體" w:hint="eastAsia"/>
+          <w:sz w:val="20"/>
+        </w:rPr>
+        <w:t xml:space="preserve"> provenance </w:t>
+      </w:r>
+      <w:r>
+        <w:rPr>
+          <w:rFonts w:eastAsia="標楷體" w:hint="eastAsia"/>
+          <w:sz w:val="20"/>
+        </w:rPr>
+        <w:t>稽核），惟上述工程整合與十七項機制之端到端品質效益不在本文評估範圍，本文</w:t>
       </w:r>
       <w:r>
         <w:rPr>
@@ -3161,49 +4166,21 @@
           <w:rFonts w:eastAsia="標楷體" w:hint="eastAsia"/>
           <w:sz w:val="20"/>
         </w:rPr>
-        <w:t>與</w:t>
-      </w:r>
-      <w:r>
-        <w:rPr>
-          <w:rFonts w:eastAsia="標楷體" w:hint="eastAsia"/>
-          <w:sz w:val="20"/>
-        </w:rPr>
-        <w:t xml:space="preserve"> pre-commit </w:t>
-      </w:r>
-      <w:r>
-        <w:rPr>
-          <w:rFonts w:eastAsia="標楷體" w:hint="eastAsia"/>
-          <w:sz w:val="20"/>
-        </w:rPr>
-        <w:t>兩條路徑為限，未另行開發專屬編輯器外掛）。框架並另實作十七項研究級擴充機制（如</w:t>
-      </w:r>
-      <w:r>
-        <w:rPr>
-          <w:rFonts w:eastAsia="標楷體" w:hint="eastAsia"/>
-          <w:sz w:val="20"/>
-        </w:rPr>
-        <w:t xml:space="preserve"> prompt-injection robustness</w:t>
-      </w:r>
-      <w:r>
-        <w:rPr>
-          <w:rFonts w:eastAsia="標楷體" w:hint="eastAsia"/>
-          <w:sz w:val="20"/>
-        </w:rPr>
-        <w:t>、多輪對話審查與</w:t>
-      </w:r>
-      <w:r>
-        <w:rPr>
-          <w:rFonts w:eastAsia="標楷體" w:hint="eastAsia"/>
-          <w:sz w:val="20"/>
-        </w:rPr>
-        <w:t xml:space="preserve"> provenance </w:t>
-      </w:r>
-      <w:r>
-        <w:rPr>
-          <w:rFonts w:eastAsia="標楷體" w:hint="eastAsia"/>
-          <w:sz w:val="20"/>
-        </w:rPr>
-        <w:t>稽核），惟上述工程整合與十七項機制之端到端品質效益不在本文評估範圍，本文</w:t>
+        <w:t>§</w:t>
+      </w:r>
+      <w:r>
+        <w:rPr>
+          <w:rFonts w:eastAsia="標楷體" w:hint="eastAsia"/>
+          <w:sz w:val="20"/>
+        </w:rPr>
+        <w:t xml:space="preserve">5 </w:t>
+      </w:r>
+      <w:r>
+        <w:rPr>
+          <w:rFonts w:eastAsia="標楷體" w:hint="eastAsia"/>
+          <w:sz w:val="20"/>
+        </w:rPr>
+        <w:t>之實驗聚焦於</w:t>
       </w:r>
       <w:r>
         <w:rPr>
@@ -3224,14 +4201,14 @@
           <w:rFonts w:eastAsia="標楷體" w:hint="eastAsia"/>
           <w:sz w:val="20"/>
         </w:rPr>
-        <w:t xml:space="preserve">5 </w:t>
-      </w:r>
-      <w:r>
-        <w:rPr>
-          <w:rFonts w:eastAsia="標楷體" w:hint="eastAsia"/>
-          <w:sz w:val="20"/>
-        </w:rPr>
-        <w:t>之實驗聚焦於</w:t>
+        <w:t xml:space="preserve">3.1 </w:t>
+      </w:r>
+      <w:r>
+        <w:rPr>
+          <w:rFonts w:eastAsia="標楷體" w:hint="eastAsia"/>
+          <w:sz w:val="20"/>
+        </w:rPr>
+        <w:t>之知識蒸餾與微調及</w:t>
       </w:r>
       <w:r>
         <w:rPr>
@@ -3252,14 +4229,28 @@
           <w:rFonts w:eastAsia="標楷體" w:hint="eastAsia"/>
           <w:sz w:val="20"/>
         </w:rPr>
-        <w:t xml:space="preserve">3.1 </w:t>
-      </w:r>
-      <w:r>
-        <w:rPr>
-          <w:rFonts w:eastAsia="標楷體" w:hint="eastAsia"/>
-          <w:sz w:val="20"/>
-        </w:rPr>
-        <w:t>之知識蒸餾與微調及</w:t>
+        <w:t xml:space="preserve">3.2 </w:t>
+      </w:r>
+      <w:r>
+        <w:rPr>
+          <w:rFonts w:eastAsia="標楷體" w:hint="eastAsia"/>
+          <w:sz w:val="20"/>
+        </w:rPr>
+        <w:t>之</w:t>
+      </w:r>
+      <w:r>
+        <w:rPr>
+          <w:rFonts w:eastAsia="標楷體" w:hint="eastAsia"/>
+          <w:sz w:val="20"/>
+        </w:rPr>
+        <w:t xml:space="preserve"> RAG </w:t>
+      </w:r>
+      <w:r>
+        <w:rPr>
+          <w:rFonts w:eastAsia="標楷體" w:hint="eastAsia"/>
+          <w:sz w:val="20"/>
+        </w:rPr>
+        <w:t>與多階段</w:t>
       </w:r>
       <w:r>
         <w:rPr>
@@ -3268,47 +4259,21 @@
         </w:rPr>
         <w:t xml:space="preserve"> </w:t>
       </w:r>
-      <w:r>
-        <w:rPr>
-          <w:rFonts w:eastAsia="標楷體" w:hint="eastAsia"/>
-          <w:sz w:val="20"/>
-        </w:rPr>
-        <w:t>§</w:t>
-      </w:r>
-      <w:r>
-        <w:rPr>
-          <w:rFonts w:eastAsia="標楷體" w:hint="eastAsia"/>
-          <w:sz w:val="20"/>
-        </w:rPr>
-        <w:t xml:space="preserve">3.2 </w:t>
-      </w:r>
-      <w:r>
-        <w:rPr>
-          <w:rFonts w:eastAsia="標楷體" w:hint="eastAsia"/>
-          <w:sz w:val="20"/>
-        </w:rPr>
-        <w:t>之</w:t>
-      </w:r>
-      <w:r>
-        <w:rPr>
-          <w:rFonts w:eastAsia="標楷體" w:hint="eastAsia"/>
-          <w:sz w:val="20"/>
-        </w:rPr>
-        <w:t xml:space="preserve"> RAG </w:t>
-      </w:r>
-      <w:r>
-        <w:rPr>
-          <w:rFonts w:eastAsia="標楷體" w:hint="eastAsia"/>
-          <w:sz w:val="20"/>
-        </w:rPr>
-        <w:t>與多階段</w:t>
-      </w:r>
-      <w:r>
-        <w:rPr>
-          <w:rFonts w:eastAsia="標楷體" w:hint="eastAsia"/>
-          <w:sz w:val="20"/>
-        </w:rPr>
-        <w:t xml:space="preserve"> CoT </w:t>
+      <w:proofErr w:type="spellStart"/>
+      <w:r>
+        <w:rPr>
+          <w:rFonts w:eastAsia="標楷體" w:hint="eastAsia"/>
+          <w:sz w:val="20"/>
+        </w:rPr>
+        <w:t>CoT</w:t>
+      </w:r>
+      <w:proofErr w:type="spellEnd"/>
+      <w:r>
+        <w:rPr>
+          <w:rFonts w:eastAsia="標楷體" w:hint="eastAsia"/>
+          <w:sz w:val="20"/>
+        </w:rPr>
+        <w:t xml:space="preserve"> </w:t>
       </w:r>
       <w:r>
         <w:rPr>
@@ -3322,7 +4287,7 @@
       <w:pPr>
         <w:jc w:val="center"/>
         <w:rPr>
-          <w:rFonts w:eastAsia="標楷體" w:hint="eastAsia"/>
+          <w:rFonts w:eastAsia="標楷體"/>
           <w:b/>
           <w:sz w:val="22"/>
           <w:szCs w:val="22"/>
@@ -3414,14 +4379,7 @@
           <w:rFonts w:eastAsia="標楷體" w:hint="eastAsia"/>
           <w:sz w:val="20"/>
         </w:rPr>
-        <w:t>筆測試資料並透過人工驗證確保品</w:t>
-      </w:r>
-      <w:r>
-        <w:rPr>
-          <w:rFonts w:eastAsia="標楷體" w:hint="eastAsia"/>
-          <w:sz w:val="20"/>
-        </w:rPr>
-        <w:t>質與正確性，避免單一資料來源造成之風格偏差，使測試資料涵蓋語法結構、命名習慣、設計模式及錯誤型態（如潛在</w:t>
+        <w:t>筆測試資料並透過人工驗證確保品質與正確性，避免單一資料來源造成之風格偏差，使測試資料涵蓋語法結構、命名習慣、設計模式及錯誤型態（如潛在</w:t>
       </w:r>
       <w:r>
         <w:rPr>
@@ -3444,12 +4402,21 @@
         </w:rPr>
         <w:t xml:space="preserve"> code smell</w:t>
       </w:r>
-      <w:r>
-        <w:rPr>
-          <w:rFonts w:eastAsia="標楷體" w:hint="eastAsia"/>
-          <w:sz w:val="20"/>
-        </w:rPr>
-        <w:t>——即功能正常但結構不良、暗示潛在維護問題之程式特徵）等多樣情境，貼近真實開發場景。</w:t>
+      <w:proofErr w:type="gramStart"/>
+      <w:r>
+        <w:rPr>
+          <w:rFonts w:eastAsia="標楷體" w:hint="eastAsia"/>
+          <w:sz w:val="20"/>
+        </w:rPr>
+        <w:t>——</w:t>
+      </w:r>
+      <w:proofErr w:type="gramEnd"/>
+      <w:r>
+        <w:rPr>
+          <w:rFonts w:eastAsia="標楷體" w:hint="eastAsia"/>
+          <w:sz w:val="20"/>
+        </w:rPr>
+        <w:t>即功能正常但結構不良、暗示潛在維護問題之程式特徵）等多樣情境，貼近真實開發場景。</w:t>
       </w:r>
       <w:r>
         <w:rPr>
@@ -3463,7 +4430,23 @@
           <w:rFonts w:eastAsia="標楷體" w:hint="eastAsia"/>
           <w:sz w:val="20"/>
         </w:rPr>
-        <w:t>筆之規模於覆蓋多維問題與控制人工標註與驗證成本之間取得平衡。</w:t>
+        <w:t>筆之規模於覆蓋多維問題與控制人工標</w:t>
+      </w:r>
+      <w:proofErr w:type="gramStart"/>
+      <w:r>
+        <w:rPr>
+          <w:rFonts w:eastAsia="標楷體" w:hint="eastAsia"/>
+          <w:sz w:val="20"/>
+        </w:rPr>
+        <w:t>註</w:t>
+      </w:r>
+      <w:proofErr w:type="gramEnd"/>
+      <w:r>
+        <w:rPr>
+          <w:rFonts w:eastAsia="標楷體" w:hint="eastAsia"/>
+          <w:sz w:val="20"/>
+        </w:rPr>
+        <w:t>與驗證成本之間取得平衡。</w:t>
       </w:r>
     </w:p>
     <w:p>
@@ -3500,8 +4483,17 @@
           <w:rFonts w:eastAsia="標楷體" w:hint="eastAsia"/>
           <w:sz w:val="20"/>
         </w:rPr>
-        <w:t>評估採</w:t>
-      </w:r>
+        <w:t>評估</w:t>
+      </w:r>
+      <w:proofErr w:type="gramStart"/>
+      <w:r>
+        <w:rPr>
+          <w:rFonts w:eastAsia="標楷體" w:hint="eastAsia"/>
+          <w:sz w:val="20"/>
+        </w:rPr>
+        <w:t>採</w:t>
+      </w:r>
+      <w:proofErr w:type="gramEnd"/>
       <w:r>
         <w:rPr>
           <w:rFonts w:eastAsia="標楷體" w:hint="eastAsia"/>
@@ -3528,14 +4520,23 @@
           <w:rFonts w:eastAsia="標楷體" w:hint="eastAsia"/>
           <w:sz w:val="20"/>
         </w:rPr>
-        <w:t>所示），即請一個不參與審查的第三方模型依固定標準替每份審查報告打分，以省去大量人工標註。系統先讀取原始程式碼與對應之審查結果，整</w:t>
-      </w:r>
-      <w:r>
-        <w:rPr>
-          <w:rFonts w:eastAsia="標楷體" w:hint="eastAsia"/>
-          <w:sz w:val="20"/>
-        </w:rPr>
-        <w:t>合為一份明確定義評分標準、評估面向與輸出格式之</w:t>
+        <w:t>所示），即請一個不參與審查的第三方模型依固定標準替每份審查報告打分，以省去大量人工標</w:t>
+      </w:r>
+      <w:proofErr w:type="gramStart"/>
+      <w:r>
+        <w:rPr>
+          <w:rFonts w:eastAsia="標楷體" w:hint="eastAsia"/>
+          <w:sz w:val="20"/>
+        </w:rPr>
+        <w:t>註</w:t>
+      </w:r>
+      <w:proofErr w:type="gramEnd"/>
+      <w:r>
+        <w:rPr>
+          <w:rFonts w:eastAsia="標楷體" w:hint="eastAsia"/>
+          <w:sz w:val="20"/>
+        </w:rPr>
+        <w:t>。系統先讀取原始程式碼與對應之審查結果，整合為一份明確定義評分標準、評估面向與輸出格式之</w:t>
       </w:r>
       <w:r>
         <w:rPr>
@@ -3654,14 +4655,7 @@
           <w:rFonts w:eastAsia="標楷體" w:hint="eastAsia"/>
           <w:sz w:val="20"/>
         </w:rPr>
-        <w:t xml:space="preserve"> </w:t>
-      </w:r>
-      <w:r>
-        <w:rPr>
-          <w:rFonts w:eastAsia="標楷體" w:hint="eastAsia"/>
-          <w:sz w:val="20"/>
-        </w:rPr>
-        <w:t xml:space="preserve">1 </w:t>
+        <w:t xml:space="preserve"> 1 </w:t>
       </w:r>
       <w:r>
         <w:rPr>
@@ -3726,7 +4720,23 @@
           <w:rFonts w:eastAsia="標楷體" w:hint="eastAsia"/>
           <w:sz w:val="20"/>
         </w:rPr>
-        <w:t>）擔任，避免模型對自身輸出評分時之偏差。為交叉驗證自動化評分之可靠度，本研究另輔以人工評分機制，由評審者就相同維度評分，使比較評估得於不依賴大量人工標註之前提下可重現且具一致性。</w:t>
+        <w:t>）擔任，避免模型對自身輸出評分時之偏差。為交叉驗證自動化評分之可靠度，本研究另輔以人工評分機制，由評審者就相同維度評分，使比較評估得於不依賴大量人工標</w:t>
+      </w:r>
+      <w:proofErr w:type="gramStart"/>
+      <w:r>
+        <w:rPr>
+          <w:rFonts w:eastAsia="標楷體" w:hint="eastAsia"/>
+          <w:sz w:val="20"/>
+        </w:rPr>
+        <w:t>註</w:t>
+      </w:r>
+      <w:proofErr w:type="gramEnd"/>
+      <w:r>
+        <w:rPr>
+          <w:rFonts w:eastAsia="標楷體" w:hint="eastAsia"/>
+          <w:sz w:val="20"/>
+        </w:rPr>
+        <w:t>之前提下可重現且具一致性。</w:t>
       </w:r>
     </w:p>
     <w:p>
@@ -3822,7 +4832,14 @@
           <w:rFonts w:eastAsia="標楷體" w:hint="eastAsia"/>
           <w:sz w:val="20"/>
         </w:rPr>
-        <w:t>：在相同參數規模下，僅導入多階段提示詞是否即可提升審查品質？</w:t>
+        <w:t>：在相同參數規模下，僅導入多階段提示</w:t>
+      </w:r>
+      <w:r>
+        <w:rPr>
+          <w:rFonts w:eastAsia="標楷體" w:hint="eastAsia"/>
+          <w:sz w:val="20"/>
+        </w:rPr>
+        <w:t>詞是否即可提升審查品質？</w:t>
       </w:r>
     </w:p>
     <w:p>
@@ -3957,7 +4974,7 @@
       <w:pPr>
         <w:jc w:val="center"/>
         <w:rPr>
-          <w:rFonts w:eastAsia="標楷體" w:hint="eastAsia"/>
+          <w:rFonts w:eastAsia="標楷體"/>
           <w:color w:val="000000"/>
           <w:sz w:val="20"/>
         </w:rPr>
@@ -4041,7 +5058,23 @@
           <w:rFonts w:eastAsia="標楷體" w:hint="eastAsia"/>
           <w:sz w:val="20"/>
         </w:rPr>
-        <w:t>為釐清四個研究問題與實驗結果之對應關係：表</w:t>
+        <w:t>為</w:t>
+      </w:r>
+      <w:proofErr w:type="gramStart"/>
+      <w:r>
+        <w:rPr>
+          <w:rFonts w:eastAsia="標楷體" w:hint="eastAsia"/>
+          <w:sz w:val="20"/>
+        </w:rPr>
+        <w:t>釐</w:t>
+      </w:r>
+      <w:proofErr w:type="gramEnd"/>
+      <w:r>
+        <w:rPr>
+          <w:rFonts w:eastAsia="標楷體" w:hint="eastAsia"/>
+          <w:sz w:val="20"/>
+        </w:rPr>
+        <w:t>清四個研究問題與實驗結果之對應關係：表</w:t>
       </w:r>
       <w:r>
         <w:rPr>
@@ -4090,7 +5123,23 @@
           <w:rFonts w:eastAsia="標楷體" w:hint="eastAsia"/>
           <w:sz w:val="20"/>
         </w:rPr>
-        <w:t xml:space="preserve"> LoRA </w:t>
+        <w:t xml:space="preserve"> </w:t>
+      </w:r>
+      <w:proofErr w:type="spellStart"/>
+      <w:r>
+        <w:rPr>
+          <w:rFonts w:eastAsia="標楷體" w:hint="eastAsia"/>
+          <w:sz w:val="20"/>
+        </w:rPr>
+        <w:t>LoRA</w:t>
+      </w:r>
+      <w:proofErr w:type="spellEnd"/>
+      <w:r>
+        <w:rPr>
+          <w:rFonts w:eastAsia="標楷體" w:hint="eastAsia"/>
+          <w:sz w:val="20"/>
+        </w:rPr>
+        <w:t xml:space="preserve"> </w:t>
       </w:r>
       <w:r>
         <w:rPr>
@@ -4104,14 +5153,7 @@
           <w:rFonts w:eastAsia="標楷體" w:hint="eastAsia"/>
           <w:sz w:val="20"/>
         </w:rPr>
-        <w:t xml:space="preserve"> vs </w:t>
-      </w:r>
-      <w:r>
-        <w:rPr>
-          <w:rFonts w:eastAsia="標楷體" w:hint="eastAsia"/>
-          <w:sz w:val="20"/>
-        </w:rPr>
-        <w:t xml:space="preserve">CRSCORE++ </w:t>
+        <w:t xml:space="preserve"> vs CRSCORE++ </w:t>
       </w:r>
       <w:r>
         <w:rPr>
@@ -4897,10 +5939,27 @@
       </w:pPr>
       <w:r>
         <w:rPr>
-          <w:rFonts w:eastAsia="標楷體" w:hint="eastAsia"/>
+          <w:rFonts w:eastAsia="標楷體"/>
           <w:b/>
           <w:sz w:val="20"/>
         </w:rPr>
+        <w:br/>
+      </w:r>
+      <w:r>
+        <w:rPr>
+          <w:rFonts w:eastAsia="標楷體"/>
+          <w:b/>
+          <w:sz w:val="20"/>
+        </w:rPr>
+        <w:br/>
+      </w:r>
+      <w:r>
+        <w:rPr>
+          <w:rFonts w:eastAsia="標楷體" w:hint="eastAsia"/>
+          <w:b/>
+          <w:sz w:val="20"/>
+        </w:rPr>
+        <w:lastRenderedPageBreak/>
         <w:t xml:space="preserve">5.2 </w:t>
       </w:r>
       <w:r>
@@ -4925,7 +5984,6 @@
           <w:rFonts w:eastAsia="標楷體" w:hint="eastAsia"/>
           <w:sz w:val="20"/>
         </w:rPr>
-        <w:lastRenderedPageBreak/>
         <w:t>RQ1</w:t>
       </w:r>
       <w:r>
@@ -5024,14 +6082,7 @@
           <w:rFonts w:eastAsia="標楷體" w:hint="eastAsia"/>
           <w:sz w:val="20"/>
         </w:rPr>
-        <w:t xml:space="preserve">0.83 vs </w:t>
-      </w:r>
-      <w:r>
-        <w:rPr>
-          <w:rFonts w:eastAsia="標楷體" w:hint="eastAsia"/>
-          <w:sz w:val="20"/>
-        </w:rPr>
-        <w:t>0.63</w:t>
+        <w:t>0.83 vs 0.63</w:t>
       </w:r>
       <w:r>
         <w:rPr>
@@ -5108,7 +6159,23 @@
           <w:rFonts w:eastAsia="標楷體" w:hint="eastAsia"/>
           <w:sz w:val="20"/>
         </w:rPr>
-        <w:t>代表更少漏看真正該提的問題，此即多階段拆解、</w:t>
+        <w:t>代表</w:t>
+      </w:r>
+      <w:proofErr w:type="gramStart"/>
+      <w:r>
+        <w:rPr>
+          <w:rFonts w:eastAsia="標楷體" w:hint="eastAsia"/>
+          <w:sz w:val="20"/>
+        </w:rPr>
+        <w:t>更少漏看</w:t>
+      </w:r>
+      <w:proofErr w:type="gramEnd"/>
+      <w:r>
+        <w:rPr>
+          <w:rFonts w:eastAsia="標楷體" w:hint="eastAsia"/>
+          <w:sz w:val="20"/>
+        </w:rPr>
+        <w:t>真正該提的問題，此即多階段拆解、</w:t>
       </w:r>
       <w:r>
         <w:rPr>
@@ -5201,14 +6268,7 @@
           <w:rFonts w:eastAsia="標楷體" w:hint="eastAsia"/>
           <w:sz w:val="20"/>
         </w:rPr>
-        <w:t>略遜，顯示即使未經微調、在同等模型容量下，光是把審查流程結構化為多階段本身就能帶來實質之品質效益，可見多階段流程是整合框架中</w:t>
-      </w:r>
-      <w:r>
-        <w:rPr>
-          <w:rFonts w:eastAsia="標楷體" w:hint="eastAsia"/>
-          <w:sz w:val="20"/>
-        </w:rPr>
-        <w:t>舉足輕重的一環，但如下節所示，它與微調、</w:t>
+        <w:t>略遜，顯示即使未經微調、在同等模型容量下，光是把審查流程結構化為多階段本身就能帶來實質之品質效益，可見多階段流程是整合框架中舉足輕重的一環，但如下節所示，它與微調、</w:t>
       </w:r>
       <w:r>
         <w:rPr>
@@ -5227,8 +6287,207 @@
     </w:p>
     <w:p>
       <w:pPr>
+        <w:jc w:val="both"/>
+        <w:rPr>
+          <w:rFonts w:eastAsia="標楷體" w:hint="eastAsia"/>
+          <w:sz w:val="20"/>
+        </w:rPr>
+      </w:pPr>
+      <w:r>
+        <w:rPr>
+          <w:rFonts w:eastAsia="標楷體" w:hint="eastAsia"/>
+          <w:sz w:val="20"/>
+        </w:rPr>
+        <w:t>RQ3</w:t>
+      </w:r>
+      <w:r>
+        <w:rPr>
+          <w:rFonts w:eastAsia="標楷體" w:hint="eastAsia"/>
+          <w:sz w:val="20"/>
+        </w:rPr>
+        <w:t>：由表</w:t>
+      </w:r>
+      <w:r>
+        <w:rPr>
+          <w:rFonts w:eastAsia="標楷體" w:hint="eastAsia"/>
+          <w:sz w:val="20"/>
+        </w:rPr>
+        <w:t xml:space="preserve"> 2 </w:t>
+      </w:r>
+      <w:r>
+        <w:rPr>
+          <w:rFonts w:eastAsia="標楷體" w:hint="eastAsia"/>
+          <w:sz w:val="20"/>
+        </w:rPr>
+        <w:t>之消融結果可將整合框架之成效分解為各元件之貢獻：自單一</w:t>
+      </w:r>
+      <w:proofErr w:type="gramStart"/>
+      <w:r>
+        <w:rPr>
+          <w:rFonts w:eastAsia="標楷體" w:hint="eastAsia"/>
+          <w:sz w:val="20"/>
+        </w:rPr>
+        <w:t>提示詞改為</w:t>
+      </w:r>
+      <w:proofErr w:type="gramEnd"/>
+      <w:r>
+        <w:rPr>
+          <w:rFonts w:eastAsia="標楷體" w:hint="eastAsia"/>
+          <w:sz w:val="20"/>
+        </w:rPr>
+        <w:t>多階段提示詞所帶來之貢獻達</w:t>
+      </w:r>
+      <w:r>
+        <w:rPr>
+          <w:rFonts w:eastAsia="標楷體" w:hint="eastAsia"/>
+          <w:sz w:val="20"/>
+        </w:rPr>
+        <w:t xml:space="preserve"> +34 </w:t>
+      </w:r>
+      <w:r>
+        <w:rPr>
+          <w:rFonts w:eastAsia="標楷體" w:hint="eastAsia"/>
+          <w:sz w:val="20"/>
+        </w:rPr>
+        <w:t>分（百分制，約等於整體品質跳了三分之一</w:t>
+      </w:r>
+      <w:proofErr w:type="gramStart"/>
+      <w:r>
+        <w:rPr>
+          <w:rFonts w:eastAsia="標楷體" w:hint="eastAsia"/>
+          <w:sz w:val="20"/>
+        </w:rPr>
+        <w:t>個</w:t>
+      </w:r>
+      <w:proofErr w:type="gramEnd"/>
+      <w:r>
+        <w:rPr>
+          <w:rFonts w:eastAsia="標楷體" w:hint="eastAsia"/>
+          <w:sz w:val="20"/>
+        </w:rPr>
+        <w:t>量級），導入</w:t>
+      </w:r>
+      <w:r>
+        <w:rPr>
+          <w:rFonts w:eastAsia="標楷體" w:hint="eastAsia"/>
+          <w:sz w:val="20"/>
+        </w:rPr>
+        <w:t xml:space="preserve"> </w:t>
+      </w:r>
+      <w:proofErr w:type="spellStart"/>
+      <w:r>
+        <w:rPr>
+          <w:rFonts w:eastAsia="標楷體" w:hint="eastAsia"/>
+          <w:sz w:val="20"/>
+        </w:rPr>
+        <w:t>LoRA</w:t>
+      </w:r>
+      <w:proofErr w:type="spellEnd"/>
+      <w:r>
+        <w:rPr>
+          <w:rFonts w:eastAsia="標楷體" w:hint="eastAsia"/>
+          <w:sz w:val="20"/>
+        </w:rPr>
+        <w:t xml:space="preserve"> </w:t>
+      </w:r>
+      <w:r>
+        <w:rPr>
+          <w:rFonts w:eastAsia="標楷體" w:hint="eastAsia"/>
+          <w:sz w:val="20"/>
+        </w:rPr>
+        <w:t>微調之邊際貢獻則約</w:t>
+      </w:r>
+      <w:r>
+        <w:rPr>
+          <w:rFonts w:eastAsia="標楷體" w:hint="eastAsia"/>
+          <w:sz w:val="20"/>
+        </w:rPr>
+        <w:t xml:space="preserve"> +2 </w:t>
+      </w:r>
+      <w:r>
+        <w:rPr>
+          <w:rFonts w:eastAsia="標楷體" w:hint="eastAsia"/>
+          <w:sz w:val="20"/>
+        </w:rPr>
+        <w:t>分。此一分解並非要在二者之間分高下，而是說明它們解決的是不同問題：多階段</w:t>
+      </w:r>
+      <w:proofErr w:type="gramStart"/>
+      <w:r>
+        <w:rPr>
+          <w:rFonts w:eastAsia="標楷體" w:hint="eastAsia"/>
+          <w:sz w:val="20"/>
+        </w:rPr>
+        <w:t>提示詞重塑</w:t>
+      </w:r>
+      <w:proofErr w:type="gramEnd"/>
+      <w:r>
+        <w:rPr>
+          <w:rFonts w:eastAsia="標楷體" w:hint="eastAsia"/>
+          <w:sz w:val="20"/>
+        </w:rPr>
+        <w:t>了審查的「流程結構」，使模型逐步推理而</w:t>
+      </w:r>
+      <w:proofErr w:type="gramStart"/>
+      <w:r>
+        <w:rPr>
+          <w:rFonts w:eastAsia="標楷體" w:hint="eastAsia"/>
+          <w:sz w:val="20"/>
+        </w:rPr>
+        <w:t>較少漏看</w:t>
+      </w:r>
+      <w:proofErr w:type="gramEnd"/>
+      <w:r>
+        <w:rPr>
+          <w:rFonts w:eastAsia="標楷體" w:hint="eastAsia"/>
+          <w:sz w:val="20"/>
+        </w:rPr>
+        <w:t>，故為單項貢獻最大之一環，</w:t>
+      </w:r>
+      <w:proofErr w:type="spellStart"/>
+      <w:r>
+        <w:rPr>
+          <w:rFonts w:eastAsia="標楷體" w:hint="eastAsia"/>
+          <w:sz w:val="20"/>
+        </w:rPr>
+        <w:t>LoRA</w:t>
+      </w:r>
+      <w:proofErr w:type="spellEnd"/>
+      <w:r>
+        <w:rPr>
+          <w:rFonts w:eastAsia="標楷體" w:hint="eastAsia"/>
+          <w:sz w:val="20"/>
+        </w:rPr>
+        <w:t xml:space="preserve"> </w:t>
+      </w:r>
+      <w:r>
+        <w:rPr>
+          <w:rFonts w:eastAsia="標楷體" w:hint="eastAsia"/>
+          <w:sz w:val="20"/>
+        </w:rPr>
+        <w:t>微調則是在有限資源下保留並穩定教師之審查能力、</w:t>
+      </w:r>
+      <w:proofErr w:type="gramStart"/>
+      <w:r>
+        <w:rPr>
+          <w:rFonts w:eastAsia="標楷體" w:hint="eastAsia"/>
+          <w:sz w:val="20"/>
+        </w:rPr>
+        <w:t>使輕量</w:t>
+      </w:r>
+      <w:proofErr w:type="gramEnd"/>
+      <w:r>
+        <w:rPr>
+          <w:rFonts w:eastAsia="標楷體" w:hint="eastAsia"/>
+          <w:sz w:val="20"/>
+        </w:rPr>
+        <w:t>學生模型得以部署，與提示詞流程互補而非競爭。二者各司其職，缺一則無法同時達成一致性與可落地之可維護性，不應將微調視為可有可無。</w:t>
+      </w:r>
+    </w:p>
+    <w:p>
+      <w:pPr>
         <w:jc w:val="center"/>
         <w:rPr>
+          <w:rFonts w:hint="eastAsia"/>
           <w:sz w:val="21"/>
           <w:szCs w:val="16"/>
         </w:rPr>
@@ -5280,99 +6539,6 @@
           <w:sz w:val="20"/>
         </w:rPr>
         <w:t>)</w:t>
-      </w:r>
-    </w:p>
-    <w:p>
-      <w:pPr>
-        <w:jc w:val="both"/>
-        <w:rPr>
-          <w:rFonts w:eastAsia="標楷體"/>
-          <w:sz w:val="20"/>
-        </w:rPr>
-      </w:pPr>
-      <w:r>
-        <w:rPr>
-          <w:rFonts w:eastAsia="標楷體" w:hint="eastAsia"/>
-          <w:sz w:val="20"/>
-        </w:rPr>
-        <w:t>RQ3</w:t>
-      </w:r>
-      <w:r>
-        <w:rPr>
-          <w:rFonts w:eastAsia="標楷體" w:hint="eastAsia"/>
-          <w:sz w:val="20"/>
-        </w:rPr>
-        <w:t>：由表</w:t>
-      </w:r>
-      <w:r>
-        <w:rPr>
-          <w:rFonts w:eastAsia="標楷體" w:hint="eastAsia"/>
-          <w:sz w:val="20"/>
-        </w:rPr>
-        <w:t xml:space="preserve"> 2 </w:t>
-      </w:r>
-      <w:r>
-        <w:rPr>
-          <w:rFonts w:eastAsia="標楷體" w:hint="eastAsia"/>
-          <w:sz w:val="20"/>
-        </w:rPr>
-        <w:t>之消融結果可將整合框架之成效分解為各元件之貢獻：自單一提示詞改為多階段提示詞所帶來之貢獻達</w:t>
-      </w:r>
-      <w:r>
-        <w:rPr>
-          <w:rFonts w:eastAsia="標楷體" w:hint="eastAsia"/>
-          <w:sz w:val="20"/>
-        </w:rPr>
-        <w:t xml:space="preserve"> +34 </w:t>
-      </w:r>
-      <w:r>
-        <w:rPr>
-          <w:rFonts w:eastAsia="標楷體" w:hint="eastAsia"/>
-          <w:sz w:val="20"/>
-        </w:rPr>
-        <w:t>分（百分制，約等於整體品質跳了三分之一個量級），導入</w:t>
-      </w:r>
-      <w:r>
-        <w:rPr>
-          <w:rFonts w:eastAsia="標楷體" w:hint="eastAsia"/>
-          <w:sz w:val="20"/>
-        </w:rPr>
-        <w:t xml:space="preserve"> LoRA </w:t>
-      </w:r>
-      <w:r>
-        <w:rPr>
-          <w:rFonts w:eastAsia="標楷體" w:hint="eastAsia"/>
-          <w:sz w:val="20"/>
-        </w:rPr>
-        <w:t>微調之邊際貢獻則約</w:t>
-      </w:r>
-      <w:r>
-        <w:rPr>
-          <w:rFonts w:eastAsia="標楷體" w:hint="eastAsia"/>
-          <w:sz w:val="20"/>
-        </w:rPr>
-        <w:t xml:space="preserve"> +2 </w:t>
-      </w:r>
-      <w:r>
-        <w:rPr>
-          <w:rFonts w:eastAsia="標楷體" w:hint="eastAsia"/>
-          <w:sz w:val="20"/>
-        </w:rPr>
-        <w:t>分。此一分解並非要在二者之間分高下，而是說明它們解決的是不同問題：多階段提示詞重塑了審查的「流程結構」，使模型逐步推理而較少漏看，故為單項貢獻最大之一環，</w:t>
-      </w:r>
-      <w:r>
-        <w:rPr>
-          <w:rFonts w:eastAsia="標楷體" w:hint="eastAsia"/>
-          <w:sz w:val="20"/>
-        </w:rPr>
-        <w:t xml:space="preserve">LoRA </w:t>
-      </w:r>
-      <w:r>
-        <w:rPr>
-          <w:rFonts w:eastAsia="標楷體" w:hint="eastAsia"/>
-          <w:sz w:val="20"/>
-        </w:rPr>
-        <w:t>微調則是在有限資源下保留並穩定教師之審查能力、使輕量學生模型得以部署，與提示詞流程互補而非競爭。二者各司其職，缺一則無法同時達成一致性與可落地之可維護性，不應將微調視為可有可無。</w:t>
       </w:r>
     </w:p>
     <w:tbl>
@@ -6923,14 +8089,46 @@
           <w:rFonts w:eastAsia="標楷體" w:hint="eastAsia"/>
           <w:sz w:val="20"/>
         </w:rPr>
-        <w:t xml:space="preserve">KD/QLoRA </w:t>
-      </w:r>
-      <w:r>
-        <w:rPr>
-          <w:rFonts w:eastAsia="標楷體" w:hint="eastAsia"/>
-          <w:sz w:val="20"/>
-        </w:rPr>
-        <w:t>之輕量化互補，三者整合方使審查同時達成三性質。不論交給機器或交給人來評，結論都指向「整合」而非「單一元件」才是成效之來源。</w:t>
+        <w:t>KD/</w:t>
+      </w:r>
+      <w:proofErr w:type="spellStart"/>
+      <w:r>
+        <w:rPr>
+          <w:rFonts w:eastAsia="標楷體" w:hint="eastAsia"/>
+          <w:sz w:val="20"/>
+        </w:rPr>
+        <w:t>QLoRA</w:t>
+      </w:r>
+      <w:proofErr w:type="spellEnd"/>
+      <w:r>
+        <w:rPr>
+          <w:rFonts w:eastAsia="標楷體" w:hint="eastAsia"/>
+          <w:sz w:val="20"/>
+        </w:rPr>
+        <w:t xml:space="preserve"> </w:t>
+      </w:r>
+      <w:r>
+        <w:rPr>
+          <w:rFonts w:eastAsia="標楷體" w:hint="eastAsia"/>
+          <w:sz w:val="20"/>
+        </w:rPr>
+        <w:t>之輕量化互補，三者整合方使審查同時達成</w:t>
+      </w:r>
+      <w:proofErr w:type="gramStart"/>
+      <w:r>
+        <w:rPr>
+          <w:rFonts w:eastAsia="標楷體" w:hint="eastAsia"/>
+          <w:sz w:val="20"/>
+        </w:rPr>
+        <w:t>三</w:t>
+      </w:r>
+      <w:proofErr w:type="gramEnd"/>
+      <w:r>
+        <w:rPr>
+          <w:rFonts w:eastAsia="標楷體" w:hint="eastAsia"/>
+          <w:sz w:val="20"/>
+        </w:rPr>
+        <w:t>性質。不論交給機器或交給人來評，結論都指向「整合」而非「單一元件」才是成效之來源。</w:t>
       </w:r>
     </w:p>
     <w:p>
@@ -7001,14 +8199,62 @@
           <w:rFonts w:eastAsia="標楷體" w:hint="eastAsia"/>
           <w:sz w:val="20"/>
         </w:rPr>
-        <w:t>用於程式碼審查時的三大問題——幻覺、輸出不穩定、缺乏領域規範——提出一套整合框架作為正面回應，以多階段</w:t>
-      </w:r>
-      <w:r>
-        <w:rPr>
-          <w:rFonts w:eastAsia="標楷體" w:hint="eastAsia"/>
-          <w:sz w:val="20"/>
-        </w:rPr>
-        <w:t xml:space="preserve"> CoT </w:t>
+        <w:t>用於程式碼審查時的三大問題</w:t>
+      </w:r>
+      <w:proofErr w:type="gramStart"/>
+      <w:r>
+        <w:rPr>
+          <w:rFonts w:eastAsia="標楷體" w:hint="eastAsia"/>
+          <w:sz w:val="20"/>
+        </w:rPr>
+        <w:t>——</w:t>
+      </w:r>
+      <w:proofErr w:type="gramEnd"/>
+      <w:r>
+        <w:rPr>
+          <w:rFonts w:eastAsia="標楷體" w:hint="eastAsia"/>
+          <w:sz w:val="20"/>
+        </w:rPr>
+        <w:t>幻覺、輸出不穩定、缺乏領域規範</w:t>
+      </w:r>
+      <w:proofErr w:type="gramStart"/>
+      <w:r>
+        <w:rPr>
+          <w:rFonts w:eastAsia="標楷體" w:hint="eastAsia"/>
+          <w:sz w:val="20"/>
+        </w:rPr>
+        <w:t>——</w:t>
+      </w:r>
+      <w:proofErr w:type="gramEnd"/>
+      <w:r>
+        <w:rPr>
+          <w:rFonts w:eastAsia="標楷體" w:hint="eastAsia"/>
+          <w:sz w:val="20"/>
+        </w:rPr>
+        <w:t>提出一套整合框架作為正面回應，以多階段</w:t>
+      </w:r>
+      <w:r>
+        <w:rPr>
+          <w:rFonts w:eastAsia="標楷體" w:hint="eastAsia"/>
+          <w:sz w:val="20"/>
+        </w:rPr>
+        <w:t xml:space="preserve"> </w:t>
+      </w:r>
+      <w:proofErr w:type="spellStart"/>
+      <w:r>
+        <w:rPr>
+          <w:rFonts w:eastAsia="標楷體" w:hint="eastAsia"/>
+          <w:sz w:val="20"/>
+        </w:rPr>
+        <w:t>CoT</w:t>
+      </w:r>
+      <w:proofErr w:type="spellEnd"/>
+      <w:r>
+        <w:rPr>
+          <w:rFonts w:eastAsia="標楷體" w:hint="eastAsia"/>
+          <w:sz w:val="20"/>
+        </w:rPr>
+        <w:t xml:space="preserve"> </w:t>
       </w:r>
       <w:r>
         <w:rPr>
@@ -7036,7 +8282,23 @@
           <w:rFonts w:eastAsia="標楷體" w:hint="eastAsia"/>
           <w:sz w:val="20"/>
         </w:rPr>
-        <w:t xml:space="preserve"> QLoRA </w:t>
+        <w:t xml:space="preserve"> </w:t>
+      </w:r>
+      <w:proofErr w:type="spellStart"/>
+      <w:r>
+        <w:rPr>
+          <w:rFonts w:eastAsia="標楷體" w:hint="eastAsia"/>
+          <w:sz w:val="20"/>
+        </w:rPr>
+        <w:t>QLoRA</w:t>
+      </w:r>
+      <w:proofErr w:type="spellEnd"/>
+      <w:r>
+        <w:rPr>
+          <w:rFonts w:eastAsia="標楷體" w:hint="eastAsia"/>
+          <w:sz w:val="20"/>
+        </w:rPr>
+        <w:t xml:space="preserve"> </w:t>
       </w:r>
       <w:r>
         <w:rPr>
@@ -7115,14 +8377,7 @@
           <w:rFonts w:eastAsia="標楷體" w:hint="eastAsia"/>
           <w:sz w:val="20"/>
         </w:rPr>
-        <w:t>），並由人工評分交叉驗證。消融分析則將此成效分解為各元件之貢獻：多階</w:t>
-      </w:r>
-      <w:r>
-        <w:rPr>
-          <w:rFonts w:eastAsia="標楷體" w:hint="eastAsia"/>
-          <w:sz w:val="20"/>
-        </w:rPr>
-        <w:t>段流程之結構化設計為單項貢獻最大之一環（</w:t>
+        <w:t>），並由人工評分交叉驗證。消融分析則將此成效分解為各元件之貢獻：多階段流程之結構化設計為單項貢獻最大之一環（</w:t>
       </w:r>
       <w:r>
         <w:rPr>
@@ -7138,12 +8393,21 @@
         </w:rPr>
         <w:t>分），</w:t>
       </w:r>
-      <w:r>
-        <w:rPr>
-          <w:rFonts w:eastAsia="標楷體" w:hint="eastAsia"/>
-          <w:sz w:val="20"/>
-        </w:rPr>
-        <w:t xml:space="preserve">LoRA </w:t>
+      <w:proofErr w:type="spellStart"/>
+      <w:r>
+        <w:rPr>
+          <w:rFonts w:eastAsia="標楷體" w:hint="eastAsia"/>
+          <w:sz w:val="20"/>
+        </w:rPr>
+        <w:t>LoRA</w:t>
+      </w:r>
+      <w:proofErr w:type="spellEnd"/>
+      <w:r>
+        <w:rPr>
+          <w:rFonts w:eastAsia="標楷體" w:hint="eastAsia"/>
+          <w:sz w:val="20"/>
+        </w:rPr>
+        <w:t xml:space="preserve"> </w:t>
       </w:r>
       <w:r>
         <w:rPr>
@@ -7178,7 +8442,23 @@
           <w:rFonts w:eastAsia="標楷體" w:hint="eastAsia"/>
           <w:sz w:val="20"/>
         </w:rPr>
-        <w:t>則提供領域規範之接地，三者互補而缺一不可。本研究的核心發現不在於某一元件勝出，而在於唯有三者整合方能同時改善三性質、回應前述三大問題。</w:t>
+        <w:t>則提供領域規範之接地，三者互補而缺一不可。本研究的核心發現不在於某一元件勝出，而在於唯有三者整合方能同時改善</w:t>
+      </w:r>
+      <w:proofErr w:type="gramStart"/>
+      <w:r>
+        <w:rPr>
+          <w:rFonts w:eastAsia="標楷體" w:hint="eastAsia"/>
+          <w:sz w:val="20"/>
+        </w:rPr>
+        <w:t>三</w:t>
+      </w:r>
+      <w:proofErr w:type="gramEnd"/>
+      <w:r>
+        <w:rPr>
+          <w:rFonts w:eastAsia="標楷體" w:hint="eastAsia"/>
+          <w:sz w:val="20"/>
+        </w:rPr>
+        <w:t>性質、回應前述三大問題。</w:t>
       </w:r>
     </w:p>
     <w:p>
@@ -7206,7 +8486,7 @@
       <w:pPr>
         <w:jc w:val="both"/>
         <w:rPr>
-          <w:rFonts w:eastAsia="標楷體" w:hint="eastAsia"/>
+          <w:rFonts w:eastAsia="標楷體"/>
           <w:sz w:val="20"/>
         </w:rPr>
       </w:pPr>
@@ -7313,28 +8593,7 @@
           <w:rFonts w:eastAsia="標楷體" w:hint="eastAsia"/>
           <w:sz w:val="20"/>
         </w:rPr>
-        <w:t>等路徑實際運作，但其可替換之多後端推論的品質、成本與延遲比較仍屬未來工作而未於本文實測，</w:t>
-      </w:r>
-      <w:r>
-        <w:rPr>
-          <w:rFonts w:eastAsia="標楷體" w:hint="eastAsia"/>
-          <w:sz w:val="20"/>
-        </w:rPr>
-        <w:t>反饋語料累積之效益、以及</w:t>
-      </w:r>
-      <w:r>
-        <w:rPr>
-          <w:rFonts w:eastAsia="標楷體" w:hint="eastAsia"/>
-          <w:sz w:val="20"/>
-        </w:rPr>
-        <w:t>十七項擴充機制之端到</w:t>
-      </w:r>
-      <w:r>
-        <w:rPr>
-          <w:rFonts w:eastAsia="標楷體" w:hint="eastAsia"/>
-          <w:sz w:val="20"/>
-        </w:rPr>
-        <w:t>端品質效益，亦均尚未於本文量化評估，留待後續逐項驗證。</w:t>
+        <w:t>等路徑實際運作，但其可替換之多後端推論的品質、成本與延遲比較仍屬未來工作而未於本文實測，反饋語料累積之效益、以及十七項擴充機制之端到端品質效益，亦均尚未於本文量化評估，留待後續逐項驗證。</w:t>
       </w:r>
     </w:p>
     <w:p>

</xml_diff>